<commit_message>
Upgrade report: professional formatting + API/Swagger run guide
- Cover page with date, metadata, GitHub link
- Table of contents
- Dark blue styled table headers, alternating row colours
- Captions under every figure
- Section 6: full API startup steps, Swagger UI walkthrough,
  endpoint table, cURL + JSON response examples
- Section 7: expanded recommendation with 5 labelled reasons,
  final comparison table with checkmark, conclusion paragraph

Co-Authored-By: Claude Sonnet 4.6 <noreply@anthropic.com>
</commit_message>
<xml_diff>
--- a/outputs/Parkinson_Evaluation_Report.docx
+++ b/outputs/Parkinson_Evaluation_Report.docx
@@ -2,22 +2,33 @@
 <file path=word/document.xml><?xml version="1.0" encoding="utf-8"?>
 <w:document xmlns:wpc="http://schemas.microsoft.com/office/word/2010/wordprocessingCanvas" xmlns:mo="http://schemas.microsoft.com/office/mac/office/2008/main" xmlns:mc="http://schemas.openxmlformats.org/markup-compatibility/2006" xmlns:mv="urn:schemas-microsoft-com:mac:vml" xmlns:o="urn:schemas-microsoft-com:office:office" xmlns:r="http://schemas.openxmlformats.org/officeDocument/2006/relationships" xmlns:m="http://schemas.openxmlformats.org/officeDocument/2006/math" xmlns:v="urn:schemas-microsoft-com:vml" xmlns:wp14="http://schemas.microsoft.com/office/word/2010/wordprocessingDrawing" xmlns:wp="http://schemas.openxmlformats.org/drawingml/2006/wordprocessingDrawing" xmlns:w10="urn:schemas-microsoft-com:office:word" xmlns:w="http://schemas.openxmlformats.org/wordprocessingml/2006/main" xmlns:w14="http://schemas.microsoft.com/office/word/2010/wordml" xmlns:wpg="http://schemas.microsoft.com/office/word/2010/wordprocessingGroup" xmlns:wpi="http://schemas.microsoft.com/office/word/2010/wordprocessingInk" xmlns:wne="http://schemas.microsoft.com/office/word/2006/wordml" xmlns:wps="http://schemas.microsoft.com/office/word/2010/wordprocessingShape" mc:Ignorable="w14 wp14">
   <w:body>
+    <w:p/>
+    <w:p/>
+    <w:p/>
     <w:p>
       <w:pPr>
-        <w:pStyle w:val="Title"/>
         <w:jc w:val="center"/>
       </w:pPr>
       <w:r>
+        <w:rPr>
+          <w:rFonts w:ascii="Calibri" w:hAnsi="Calibri"/>
+          <w:b/>
+          <w:color w:val="1F497D"/>
+          <w:sz w:val="56"/>
+        </w:rPr>
         <w:t>Parkinson's Disease Prediction</w:t>
       </w:r>
     </w:p>
+    <w:p/>
     <w:p>
       <w:pPr>
         <w:jc w:val="center"/>
       </w:pPr>
       <w:r>
         <w:rPr>
-          <w:b/>
+          <w:rFonts w:ascii="Calibri" w:hAnsi="Calibri"/>
+          <w:color w:val="444444"/>
+          <w:sz w:val="32"/>
         </w:rPr>
         <w:t>Model Evaluation &amp; Explainability Report</w:t>
       </w:r>
@@ -25,72 +36,687 @@
     <w:p/>
     <w:p>
       <w:pPr>
+        <w:jc w:val="center"/>
+      </w:pPr>
+      <w:r>
+        <w:t>───────────────────────────────────────────────────────</w:t>
+      </w:r>
+    </w:p>
+    <w:p/>
+    <w:p>
+      <w:pPr>
+        <w:spacing w:before="40" w:after="40"/>
+        <w:jc w:val="center"/>
+      </w:pPr>
+      <w:r>
+        <w:rPr>
+          <w:rFonts w:ascii="Calibri" w:hAnsi="Calibri"/>
+          <w:color w:val="333333"/>
+          <w:sz w:val="22"/>
+        </w:rPr>
+        <w:t>Date: 06 April 2026</w:t>
+      </w:r>
+    </w:p>
+    <w:p>
+      <w:pPr>
+        <w:spacing w:before="40" w:after="40"/>
+        <w:jc w:val="center"/>
+      </w:pPr>
+      <w:r>
+        <w:rPr>
+          <w:rFonts w:ascii="Calibri" w:hAnsi="Calibri"/>
+          <w:color w:val="333333"/>
+          <w:sz w:val="22"/>
+        </w:rPr>
+        <w:t>Dataset: Parkinson's Disease Voice Measurements</w:t>
+      </w:r>
+    </w:p>
+    <w:p>
+      <w:pPr>
+        <w:spacing w:before="40" w:after="40"/>
+        <w:jc w:val="center"/>
+      </w:pPr>
+      <w:r>
+        <w:rPr>
+          <w:rFonts w:ascii="Calibri" w:hAnsi="Calibri"/>
+          <w:color w:val="333333"/>
+          <w:sz w:val="22"/>
+        </w:rPr>
+        <w:t>Models: Logistic Regression · Random Forest · XGBoost</w:t>
+      </w:r>
+    </w:p>
+    <w:p>
+      <w:pPr>
+        <w:spacing w:before="40" w:after="40"/>
+        <w:jc w:val="center"/>
+      </w:pPr>
+      <w:r>
+        <w:rPr>
+          <w:rFonts w:ascii="Calibri" w:hAnsi="Calibri"/>
+          <w:color w:val="333333"/>
+          <w:sz w:val="22"/>
+        </w:rPr>
+        <w:t>Framework: scikit-learn · XGBoost · SHAP · FastAPI</w:t>
+      </w:r>
+    </w:p>
+    <w:p/>
+    <w:p/>
+    <w:p>
+      <w:pPr>
+        <w:jc w:val="center"/>
+      </w:pPr>
+      <w:r>
+        <w:rPr>
+          <w:rFonts w:ascii="Calibri" w:hAnsi="Calibri"/>
+          <w:color w:val="1F497D"/>
+          <w:sz w:val="20"/>
+        </w:rPr>
+        <w:t>GitHub: https://github.com/surajmhulke/parkinson-disease-prediction</w:t>
+      </w:r>
+    </w:p>
+    <w:p>
+      <w:r>
+        <w:br w:type="page"/>
+      </w:r>
+    </w:p>
+    <w:p>
+      <w:pPr>
         <w:pStyle w:val="Heading1"/>
+        <w:spacing w:before="240" w:after="80"/>
         <w:jc w:val="left"/>
       </w:pPr>
       <w:r>
+        <w:rPr>
+          <w:b/>
+          <w:color w:val="1F497D"/>
+          <w:sz w:val="32"/>
+        </w:rPr>
+        <w:t>Table of Contents</w:t>
+      </w:r>
+    </w:p>
+    <w:p>
+      <w:pPr>
+        <w:pBdr>
+          <w:bottom w:val="single" w:sz="6" w:space="1" w:color="1F497D"/>
+        </w:pBdr>
+        <w:spacing w:before="80" w:after="80"/>
+      </w:pPr>
+    </w:p>
+    <w:tbl>
+      <w:tblPr>
+        <w:tblStyle w:val="TableGrid"/>
+        <w:tblW w:type="auto" w:w="0"/>
+        <w:tblLook w:firstColumn="1" w:firstRow="1" w:lastColumn="0" w:lastRow="0" w:noHBand="0" w:noVBand="1" w:val="04A0"/>
+      </w:tblPr>
+      <w:tblGrid>
+        <w:gridCol w:w="3022"/>
+        <w:gridCol w:w="3022"/>
+        <w:gridCol w:w="3022"/>
+      </w:tblGrid>
+      <w:tr>
+        <w:tc>
+          <w:tcPr>
+            <w:tcW w:type="dxa" w:w="3022"/>
+            <w:shd w:val="clear" w:color="auto" w:fill="F2F2F2"/>
+          </w:tcPr>
+          <w:p>
+            <w:pPr>
+              <w:jc w:val="left"/>
+            </w:pPr>
+            <w:r/>
+            <w:r>
+              <w:rPr>
+                <w:rFonts w:ascii="Calibri" w:hAnsi="Calibri"/>
+                <w:b/>
+                <w:color w:val="1F497D"/>
+                <w:sz w:val="21"/>
+              </w:rPr>
+              <w:t>1.</w:t>
+            </w:r>
+          </w:p>
+        </w:tc>
+        <w:tc>
+          <w:tcPr>
+            <w:tcW w:type="dxa" w:w="3022"/>
+            <w:shd w:val="clear" w:color="auto" w:fill="FFFFFF"/>
+          </w:tcPr>
+          <w:p>
+            <w:pPr>
+              <w:jc w:val="left"/>
+            </w:pPr>
+            <w:r/>
+            <w:r>
+              <w:rPr>
+                <w:rFonts w:ascii="Calibri" w:hAnsi="Calibri"/>
+                <w:sz w:val="21"/>
+              </w:rPr>
+              <w:t>Data Understanding &amp; Preprocessing</w:t>
+            </w:r>
+          </w:p>
+        </w:tc>
+        <w:tc>
+          <w:tcPr>
+            <w:tcW w:type="dxa" w:w="3022"/>
+            <w:shd w:val="clear" w:color="auto" w:fill="F2F2F2"/>
+          </w:tcPr>
+          <w:p>
+            <w:pPr>
+              <w:jc w:val="right"/>
+            </w:pPr>
+            <w:r/>
+            <w:r>
+              <w:rPr>
+                <w:rFonts w:ascii="Calibri" w:hAnsi="Calibri"/>
+                <w:sz w:val="21"/>
+              </w:rPr>
+              <w:t>3</w:t>
+            </w:r>
+          </w:p>
+        </w:tc>
+      </w:tr>
+      <w:tr>
+        <w:tc>
+          <w:tcPr>
+            <w:tcW w:type="dxa" w:w="3022"/>
+            <w:shd w:val="clear" w:color="auto" w:fill="F2F2F2"/>
+          </w:tcPr>
+          <w:p>
+            <w:pPr>
+              <w:jc w:val="left"/>
+            </w:pPr>
+            <w:r/>
+            <w:r>
+              <w:rPr>
+                <w:rFonts w:ascii="Calibri" w:hAnsi="Calibri"/>
+                <w:b/>
+                <w:color w:val="1F497D"/>
+                <w:sz w:val="21"/>
+              </w:rPr>
+              <w:t>2.</w:t>
+            </w:r>
+          </w:p>
+        </w:tc>
+        <w:tc>
+          <w:tcPr>
+            <w:tcW w:type="dxa" w:w="3022"/>
+            <w:shd w:val="clear" w:color="auto" w:fill="FFFFFF"/>
+          </w:tcPr>
+          <w:p>
+            <w:pPr>
+              <w:jc w:val="left"/>
+            </w:pPr>
+            <w:r/>
+            <w:r>
+              <w:rPr>
+                <w:rFonts w:ascii="Calibri" w:hAnsi="Calibri"/>
+                <w:sz w:val="21"/>
+              </w:rPr>
+              <w:t>Model Development</w:t>
+            </w:r>
+          </w:p>
+        </w:tc>
+        <w:tc>
+          <w:tcPr>
+            <w:tcW w:type="dxa" w:w="3022"/>
+            <w:shd w:val="clear" w:color="auto" w:fill="F2F2F2"/>
+          </w:tcPr>
+          <w:p>
+            <w:pPr>
+              <w:jc w:val="right"/>
+            </w:pPr>
+            <w:r/>
+            <w:r>
+              <w:rPr>
+                <w:rFonts w:ascii="Calibri" w:hAnsi="Calibri"/>
+                <w:sz w:val="21"/>
+              </w:rPr>
+              <w:t>4</w:t>
+            </w:r>
+          </w:p>
+        </w:tc>
+      </w:tr>
+      <w:tr>
+        <w:tc>
+          <w:tcPr>
+            <w:tcW w:type="dxa" w:w="3022"/>
+            <w:shd w:val="clear" w:color="auto" w:fill="F2F2F2"/>
+          </w:tcPr>
+          <w:p>
+            <w:pPr>
+              <w:jc w:val="left"/>
+            </w:pPr>
+            <w:r/>
+            <w:r>
+              <w:rPr>
+                <w:rFonts w:ascii="Calibri" w:hAnsi="Calibri"/>
+                <w:b/>
+                <w:color w:val="1F497D"/>
+                <w:sz w:val="21"/>
+              </w:rPr>
+              <w:t>3.</w:t>
+            </w:r>
+          </w:p>
+        </w:tc>
+        <w:tc>
+          <w:tcPr>
+            <w:tcW w:type="dxa" w:w="3022"/>
+            <w:shd w:val="clear" w:color="auto" w:fill="FFFFFF"/>
+          </w:tcPr>
+          <w:p>
+            <w:pPr>
+              <w:jc w:val="left"/>
+            </w:pPr>
+            <w:r/>
+            <w:r>
+              <w:rPr>
+                <w:rFonts w:ascii="Calibri" w:hAnsi="Calibri"/>
+                <w:sz w:val="21"/>
+              </w:rPr>
+              <w:t>Model Evaluation &amp; Metrics</w:t>
+            </w:r>
+          </w:p>
+        </w:tc>
+        <w:tc>
+          <w:tcPr>
+            <w:tcW w:type="dxa" w:w="3022"/>
+            <w:shd w:val="clear" w:color="auto" w:fill="F2F2F2"/>
+          </w:tcPr>
+          <w:p>
+            <w:pPr>
+              <w:jc w:val="right"/>
+            </w:pPr>
+            <w:r/>
+            <w:r>
+              <w:rPr>
+                <w:rFonts w:ascii="Calibri" w:hAnsi="Calibri"/>
+                <w:sz w:val="21"/>
+              </w:rPr>
+              <w:t>5</w:t>
+            </w:r>
+          </w:p>
+        </w:tc>
+      </w:tr>
+      <w:tr>
+        <w:tc>
+          <w:tcPr>
+            <w:tcW w:type="dxa" w:w="3022"/>
+            <w:shd w:val="clear" w:color="auto" w:fill="F2F2F2"/>
+          </w:tcPr>
+          <w:p>
+            <w:pPr>
+              <w:jc w:val="left"/>
+            </w:pPr>
+            <w:r/>
+            <w:r>
+              <w:rPr>
+                <w:rFonts w:ascii="Calibri" w:hAnsi="Calibri"/>
+                <w:b/>
+                <w:color w:val="1F497D"/>
+                <w:sz w:val="21"/>
+              </w:rPr>
+              <w:t>4.</w:t>
+            </w:r>
+          </w:p>
+        </w:tc>
+        <w:tc>
+          <w:tcPr>
+            <w:tcW w:type="dxa" w:w="3022"/>
+            <w:shd w:val="clear" w:color="auto" w:fill="FFFFFF"/>
+          </w:tcPr>
+          <w:p>
+            <w:pPr>
+              <w:jc w:val="left"/>
+            </w:pPr>
+            <w:r/>
+            <w:r>
+              <w:rPr>
+                <w:rFonts w:ascii="Calibri" w:hAnsi="Calibri"/>
+                <w:sz w:val="21"/>
+              </w:rPr>
+              <w:t>Feature Importance Analysis</w:t>
+            </w:r>
+          </w:p>
+        </w:tc>
+        <w:tc>
+          <w:tcPr>
+            <w:tcW w:type="dxa" w:w="3022"/>
+            <w:shd w:val="clear" w:color="auto" w:fill="F2F2F2"/>
+          </w:tcPr>
+          <w:p>
+            <w:pPr>
+              <w:jc w:val="right"/>
+            </w:pPr>
+            <w:r/>
+            <w:r>
+              <w:rPr>
+                <w:rFonts w:ascii="Calibri" w:hAnsi="Calibri"/>
+                <w:sz w:val="21"/>
+              </w:rPr>
+              <w:t>7</w:t>
+            </w:r>
+          </w:p>
+        </w:tc>
+      </w:tr>
+      <w:tr>
+        <w:tc>
+          <w:tcPr>
+            <w:tcW w:type="dxa" w:w="3022"/>
+            <w:shd w:val="clear" w:color="auto" w:fill="F2F2F2"/>
+          </w:tcPr>
+          <w:p>
+            <w:pPr>
+              <w:jc w:val="left"/>
+            </w:pPr>
+            <w:r/>
+            <w:r>
+              <w:rPr>
+                <w:rFonts w:ascii="Calibri" w:hAnsi="Calibri"/>
+                <w:b/>
+                <w:color w:val="1F497D"/>
+                <w:sz w:val="21"/>
+              </w:rPr>
+              <w:t>5.</w:t>
+            </w:r>
+          </w:p>
+        </w:tc>
+        <w:tc>
+          <w:tcPr>
+            <w:tcW w:type="dxa" w:w="3022"/>
+            <w:shd w:val="clear" w:color="auto" w:fill="FFFFFF"/>
+          </w:tcPr>
+          <w:p>
+            <w:pPr>
+              <w:jc w:val="left"/>
+            </w:pPr>
+            <w:r/>
+            <w:r>
+              <w:rPr>
+                <w:rFonts w:ascii="Calibri" w:hAnsi="Calibri"/>
+                <w:sz w:val="21"/>
+              </w:rPr>
+              <w:t>SHAP Explainability</w:t>
+            </w:r>
+          </w:p>
+        </w:tc>
+        <w:tc>
+          <w:tcPr>
+            <w:tcW w:type="dxa" w:w="3022"/>
+            <w:shd w:val="clear" w:color="auto" w:fill="F2F2F2"/>
+          </w:tcPr>
+          <w:p>
+            <w:pPr>
+              <w:jc w:val="right"/>
+            </w:pPr>
+            <w:r/>
+            <w:r>
+              <w:rPr>
+                <w:rFonts w:ascii="Calibri" w:hAnsi="Calibri"/>
+                <w:sz w:val="21"/>
+              </w:rPr>
+              <w:t>8</w:t>
+            </w:r>
+          </w:p>
+        </w:tc>
+      </w:tr>
+      <w:tr>
+        <w:tc>
+          <w:tcPr>
+            <w:tcW w:type="dxa" w:w="3022"/>
+            <w:shd w:val="clear" w:color="auto" w:fill="F2F2F2"/>
+          </w:tcPr>
+          <w:p>
+            <w:pPr>
+              <w:jc w:val="left"/>
+            </w:pPr>
+            <w:r/>
+            <w:r>
+              <w:rPr>
+                <w:rFonts w:ascii="Calibri" w:hAnsi="Calibri"/>
+                <w:b/>
+                <w:color w:val="1F497D"/>
+                <w:sz w:val="21"/>
+              </w:rPr>
+              <w:t>6.</w:t>
+            </w:r>
+          </w:p>
+        </w:tc>
+        <w:tc>
+          <w:tcPr>
+            <w:tcW w:type="dxa" w:w="3022"/>
+            <w:shd w:val="clear" w:color="auto" w:fill="FFFFFF"/>
+          </w:tcPr>
+          <w:p>
+            <w:pPr>
+              <w:jc w:val="left"/>
+            </w:pPr>
+            <w:r/>
+            <w:r>
+              <w:rPr>
+                <w:rFonts w:ascii="Calibri" w:hAnsi="Calibri"/>
+                <w:sz w:val="21"/>
+              </w:rPr>
+              <w:t>API Usage — Running &amp; Swagger</w:t>
+            </w:r>
+          </w:p>
+        </w:tc>
+        <w:tc>
+          <w:tcPr>
+            <w:tcW w:type="dxa" w:w="3022"/>
+            <w:shd w:val="clear" w:color="auto" w:fill="F2F2F2"/>
+          </w:tcPr>
+          <w:p>
+            <w:pPr>
+              <w:jc w:val="right"/>
+            </w:pPr>
+            <w:r/>
+            <w:r>
+              <w:rPr>
+                <w:rFonts w:ascii="Calibri" w:hAnsi="Calibri"/>
+                <w:sz w:val="21"/>
+              </w:rPr>
+              <w:t>9</w:t>
+            </w:r>
+          </w:p>
+        </w:tc>
+      </w:tr>
+      <w:tr>
+        <w:tc>
+          <w:tcPr>
+            <w:tcW w:type="dxa" w:w="3022"/>
+            <w:shd w:val="clear" w:color="auto" w:fill="F2F2F2"/>
+          </w:tcPr>
+          <w:p>
+            <w:pPr>
+              <w:jc w:val="left"/>
+            </w:pPr>
+            <w:r/>
+            <w:r>
+              <w:rPr>
+                <w:rFonts w:ascii="Calibri" w:hAnsi="Calibri"/>
+                <w:b/>
+                <w:color w:val="1F497D"/>
+                <w:sz w:val="21"/>
+              </w:rPr>
+              <w:t>7.</w:t>
+            </w:r>
+          </w:p>
+        </w:tc>
+        <w:tc>
+          <w:tcPr>
+            <w:tcW w:type="dxa" w:w="3022"/>
+            <w:shd w:val="clear" w:color="auto" w:fill="FFFFFF"/>
+          </w:tcPr>
+          <w:p>
+            <w:pPr>
+              <w:jc w:val="left"/>
+            </w:pPr>
+            <w:r/>
+            <w:r>
+              <w:rPr>
+                <w:rFonts w:ascii="Calibri" w:hAnsi="Calibri"/>
+                <w:sz w:val="21"/>
+              </w:rPr>
+              <w:t>Recommendation &amp; Conclusion</w:t>
+            </w:r>
+          </w:p>
+        </w:tc>
+        <w:tc>
+          <w:tcPr>
+            <w:tcW w:type="dxa" w:w="3022"/>
+            <w:shd w:val="clear" w:color="auto" w:fill="F2F2F2"/>
+          </w:tcPr>
+          <w:p>
+            <w:pPr>
+              <w:jc w:val="right"/>
+            </w:pPr>
+            <w:r/>
+            <w:r>
+              <w:rPr>
+                <w:rFonts w:ascii="Calibri" w:hAnsi="Calibri"/>
+                <w:sz w:val="21"/>
+              </w:rPr>
+              <w:t>10</w:t>
+            </w:r>
+          </w:p>
+        </w:tc>
+      </w:tr>
+    </w:tbl>
+    <w:p/>
+    <w:p>
+      <w:r>
+        <w:br w:type="page"/>
+      </w:r>
+    </w:p>
+    <w:p>
+      <w:pPr>
+        <w:pStyle w:val="Heading1"/>
+        <w:spacing w:before="240" w:after="80"/>
+        <w:jc w:val="left"/>
+      </w:pPr>
+      <w:r>
+        <w:rPr>
+          <w:b/>
+          <w:color w:val="1F497D"/>
+          <w:sz w:val="32"/>
+        </w:rPr>
         <w:t>1. Data Understanding &amp; Preprocessing</w:t>
       </w:r>
     </w:p>
     <w:p>
       <w:pPr>
+        <w:pBdr>
+          <w:bottom w:val="single" w:sz="6" w:space="1" w:color="1F497D"/>
+        </w:pBdr>
+        <w:spacing w:before="80" w:after="80"/>
+      </w:pPr>
+    </w:p>
+    <w:p>
+      <w:pPr>
         <w:pStyle w:val="Heading2"/>
+        <w:spacing w:before="240" w:after="80"/>
         <w:jc w:val="left"/>
       </w:pPr>
       <w:r>
+        <w:rPr>
+          <w:color w:val="1F497D"/>
+          <w:sz w:val="26"/>
+        </w:rPr>
         <w:t>1.1 Dataset Overview</w:t>
       </w:r>
     </w:p>
     <w:p>
       <w:pPr>
-        <w:jc w:val="left"/>
+        <w:spacing w:before="0" w:after="120"/>
+        <w:jc w:val="both"/>
       </w:pPr>
       <w:r>
-        <w:t>The dataset contains 756 voice recordings from 252 patients (188 with Parkinson's disease, 64 healthy controls). Each recording has 754 acoustic features including MFCC coefficients, TQWT features, jitter, shimmer, and nonlinear dynamical measures. The target variable 'class' is binary: 1 = Parkinson's, 0 = Healthy.</w:t>
+        <w:rPr>
+          <w:rFonts w:ascii="Calibri" w:hAnsi="Calibri"/>
+          <w:sz w:val="21"/>
+        </w:rPr>
+        <w:t>The dataset contains 756 voice recordings collected from 252 patients — 188 diagnosed with Parkinson's disease and 64 healthy controls. Each recording is characterised by 754 acoustic features spanning MFCC coefficients, TQWT (Tunable Q-factor Wavelet Transform) sub-band features, jitter, shimmer, and nonlinear dynamical complexity measures. The binary target variable 'class' encodes: 1 = Parkinson's Disease, 0 = Healthy.</w:t>
       </w:r>
     </w:p>
     <w:p>
       <w:pPr>
-        <w:jc w:val="left"/>
+        <w:spacing w:before="0" w:after="120"/>
+        <w:jc w:val="both"/>
       </w:pPr>
       <w:r>
-        <w:t>Dataset source: https://media.geeksforgeeks.org/wp-content/uploads/20250122143413596644/parkinson_disease.csv</w:t>
+        <w:rPr>
+          <w:rFonts w:ascii="Calibri" w:hAnsi="Calibri"/>
+          <w:sz w:val="21"/>
+        </w:rPr>
+        <w:t>Dataset URL: https://media.geeksforgeeks.org/wp-content/uploads/20250122143413596644/parkinson_disease.csv</w:t>
       </w:r>
     </w:p>
     <w:p>
       <w:pPr>
         <w:pStyle w:val="Heading2"/>
+        <w:spacing w:before="240" w:after="80"/>
         <w:jc w:val="left"/>
       </w:pPr>
       <w:r>
-        <w:t>1.2 Exploratory Data Analysis</w:t>
+        <w:rPr>
+          <w:color w:val="1F497D"/>
+          <w:sz w:val="26"/>
+        </w:rPr>
+        <w:t>1.2 Exploratory Data Analysis (EDA)</w:t>
       </w:r>
     </w:p>
     <w:p>
       <w:pPr>
-        <w:jc w:val="left"/>
+        <w:pStyle w:val="ListBullet"/>
+        <w:spacing w:before="0" w:after="60"/>
       </w:pPr>
       <w:r>
-        <w:t>Key EDA findings:</w:t>
-        <w:br/>
-        <w:t>• Total missing values: 0 (no imputation required)</w:t>
-        <w:br/>
-        <w:t>• Class imbalance: 74.6% Parkinson's, 25.4% Healthy — addressed with RandomOverSampler</w:t>
-        <w:br/>
-        <w:t>• 755 columns including ID and class; data types: float64 (749), int64 (6)</w:t>
-        <w:br/>
-        <w:t>• Many features are highly correlated (r &gt; 0.7), requiring pruning</w:t>
+        <w:rPr>
+          <w:rFonts w:ascii="Calibri" w:hAnsi="Calibri"/>
+          <w:sz w:val="21"/>
+        </w:rPr>
+        <w:t>Total missing values: 0 — no imputation required</w:t>
       </w:r>
     </w:p>
     <w:p>
       <w:pPr>
-        <w:pStyle w:val="Heading3"/>
-        <w:jc w:val="left"/>
+        <w:pStyle w:val="ListBullet"/>
+        <w:spacing w:before="0" w:after="60"/>
       </w:pPr>
       <w:r>
-        <w:t>Class Distribution</w:t>
+        <w:rPr>
+          <w:rFonts w:ascii="Calibri" w:hAnsi="Calibri"/>
+          <w:sz w:val="21"/>
+        </w:rPr>
+        <w:t>Class imbalance: 74.6% Parkinson's vs 25.4% Healthy — addressed using RandomOverSampler</w:t>
       </w:r>
     </w:p>
+    <w:p>
+      <w:pPr>
+        <w:pStyle w:val="ListBullet"/>
+        <w:spacing w:before="0" w:after="60"/>
+      </w:pPr>
+      <w:r>
+        <w:rPr>
+          <w:rFonts w:ascii="Calibri" w:hAnsi="Calibri"/>
+          <w:sz w:val="21"/>
+        </w:rPr>
+        <w:t>Dataset dimensions: 756 rows × 755 columns (float64: 749, int64: 6)</w:t>
+      </w:r>
+    </w:p>
+    <w:p>
+      <w:pPr>
+        <w:pStyle w:val="ListBullet"/>
+        <w:spacing w:before="0" w:after="60"/>
+      </w:pPr>
+      <w:r>
+        <w:rPr>
+          <w:rFonts w:ascii="Calibri" w:hAnsi="Calibri"/>
+          <w:sz w:val="21"/>
+        </w:rPr>
+        <w:t>High inter-feature correlation observed (r &gt; 0.7) — requires pruning before modelling</w:t>
+      </w:r>
+    </w:p>
+    <w:p/>
     <w:p>
       <w:pPr>
         <w:jc w:val="center"/>
@@ -132,11 +758,16 @@
     </w:p>
     <w:p>
       <w:pPr>
-        <w:pStyle w:val="Heading3"/>
-        <w:jc w:val="left"/>
+        <w:spacing w:before="40" w:after="200"/>
+        <w:jc w:val="center"/>
       </w:pPr>
       <w:r>
-        <w:t>Feature Correlation Heatmap (first 20 features)</w:t>
+        <w:rPr>
+          <w:i/>
+          <w:color w:val="666666"/>
+          <w:sz w:val="18"/>
+        </w:rPr>
+        <w:t>Figure 1 — Class distribution: Parkinson's vs Healthy patients</w:t>
       </w:r>
     </w:p>
     <w:p>
@@ -180,31 +811,309 @@
     </w:p>
     <w:p>
       <w:pPr>
-        <w:pStyle w:val="Heading2"/>
-        <w:jc w:val="left"/>
+        <w:spacing w:before="40" w:after="200"/>
+        <w:jc w:val="center"/>
       </w:pPr>
       <w:r>
-        <w:t>1.3 Preprocessing Steps</w:t>
+        <w:rPr>
+          <w:i/>
+          <w:color w:val="666666"/>
+          <w:sz w:val="18"/>
+        </w:rPr>
+        <w:t>Figure 2 — Pearson correlation heatmap (first 20 features)</w:t>
       </w:r>
     </w:p>
     <w:p>
       <w:pPr>
+        <w:pStyle w:val="Heading2"/>
+        <w:spacing w:before="240" w:after="80"/>
         <w:jc w:val="left"/>
       </w:pPr>
       <w:r>
-        <w:t>1. Patient-level aggregation: Multiple recordings per patient averaged (groupby patient ID) → 252 unique patients</w:t>
-        <w:br/>
-        <w:t>2. Correlation filter: Features with pairwise correlation &gt; 0.7 removed → 754 → 287 features</w:t>
-        <w:br/>
-        <w:t>3. Feature selection: SelectKBest with chi-squared test, top 30 features retained</w:t>
-        <w:br/>
-        <w:t>4. Scaling: MinMaxScaler applied before chi-squared selection</w:t>
-        <w:br/>
-        <w:t>5. Train/val split: 80/20 stratified split (random_state=10)</w:t>
-        <w:br/>
-        <w:t>6. Oversampling: RandomOverSampler (strategy=1.0) applied to training set → balanced 151/151</w:t>
-        <w:br/>
-        <w:br/>
+        <w:rPr>
+          <w:color w:val="1F497D"/>
+          <w:sz w:val="26"/>
+        </w:rPr>
+        <w:t>1.3 Preprocessing Pipeline</w:t>
+      </w:r>
+    </w:p>
+    <w:tbl>
+      <w:tblPr>
+        <w:tblStyle w:val="TableGrid"/>
+        <w:tblW w:type="auto" w:w="0"/>
+        <w:tblLook w:firstColumn="1" w:firstRow="1" w:lastColumn="0" w:lastRow="0" w:noHBand="0" w:noVBand="1" w:val="04A0"/>
+      </w:tblPr>
+      <w:tblGrid>
+        <w:gridCol w:w="4533"/>
+        <w:gridCol w:w="4533"/>
+      </w:tblGrid>
+      <w:tr>
+        <w:tc>
+          <w:tcPr>
+            <w:tcW w:type="dxa" w:w="4533"/>
+            <w:shd w:val="clear" w:color="auto" w:fill="1F497D"/>
+          </w:tcPr>
+          <w:p>
+            <w:pPr>
+              <w:jc w:val="center"/>
+            </w:pPr>
+            <w:r/>
+            <w:r>
+              <w:rPr>
+                <w:rFonts w:ascii="Calibri" w:hAnsi="Calibri"/>
+                <w:b/>
+                <w:color w:val="FFFFFF"/>
+                <w:sz w:val="20"/>
+              </w:rPr>
+              <w:t>Step</w:t>
+            </w:r>
+          </w:p>
+        </w:tc>
+        <w:tc>
+          <w:tcPr>
+            <w:tcW w:type="dxa" w:w="4533"/>
+            <w:shd w:val="clear" w:color="auto" w:fill="1F497D"/>
+          </w:tcPr>
+          <w:p>
+            <w:pPr>
+              <w:jc w:val="center"/>
+            </w:pPr>
+            <w:r/>
+            <w:r>
+              <w:rPr>
+                <w:rFonts w:ascii="Calibri" w:hAnsi="Calibri"/>
+                <w:b/>
+                <w:color w:val="FFFFFF"/>
+                <w:sz w:val="20"/>
+              </w:rPr>
+              <w:t>Description</w:t>
+            </w:r>
+          </w:p>
+        </w:tc>
+      </w:tr>
+      <w:tr>
+        <w:tc>
+          <w:tcPr>
+            <w:tcW w:type="dxa" w:w="4533"/>
+            <w:shd w:val="clear" w:color="auto" w:fill="F2F2F2"/>
+          </w:tcPr>
+          <w:p>
+            <w:r/>
+            <w:r>
+              <w:rPr>
+                <w:rFonts w:ascii="Calibri" w:hAnsi="Calibri"/>
+                <w:b/>
+                <w:sz w:val="20"/>
+              </w:rPr>
+              <w:t>Patient Aggregation</w:t>
+            </w:r>
+          </w:p>
+        </w:tc>
+        <w:tc>
+          <w:tcPr>
+            <w:tcW w:type="dxa" w:w="4533"/>
+            <w:shd w:val="clear" w:color="auto" w:fill="FFFFFF"/>
+          </w:tcPr>
+          <w:p>
+            <w:r/>
+            <w:r>
+              <w:rPr>
+                <w:rFonts w:ascii="Calibri" w:hAnsi="Calibri"/>
+                <w:sz w:val="20"/>
+              </w:rPr>
+              <w:t>Multiple recordings per patient averaged using groupby(id).mean() → 252 unique patients</w:t>
+            </w:r>
+          </w:p>
+        </w:tc>
+      </w:tr>
+      <w:tr>
+        <w:tc>
+          <w:tcPr>
+            <w:tcW w:type="dxa" w:w="4533"/>
+            <w:shd w:val="clear" w:color="auto" w:fill="FFFFFF"/>
+          </w:tcPr>
+          <w:p>
+            <w:r/>
+            <w:r>
+              <w:rPr>
+                <w:rFonts w:ascii="Calibri" w:hAnsi="Calibri"/>
+                <w:b/>
+                <w:sz w:val="20"/>
+              </w:rPr>
+              <w:t>Correlation Filter</w:t>
+            </w:r>
+          </w:p>
+        </w:tc>
+        <w:tc>
+          <w:tcPr>
+            <w:tcW w:type="dxa" w:w="4533"/>
+            <w:shd w:val="clear" w:color="auto" w:fill="F2F2F2"/>
+          </w:tcPr>
+          <w:p>
+            <w:r/>
+            <w:r>
+              <w:rPr>
+                <w:rFonts w:ascii="Calibri" w:hAnsi="Calibri"/>
+                <w:sz w:val="20"/>
+              </w:rPr>
+              <w:t>Feature pairs with |r| &gt; 0.7 removed → 754 → 287 features retained</w:t>
+            </w:r>
+          </w:p>
+        </w:tc>
+      </w:tr>
+      <w:tr>
+        <w:tc>
+          <w:tcPr>
+            <w:tcW w:type="dxa" w:w="4533"/>
+            <w:shd w:val="clear" w:color="auto" w:fill="F2F2F2"/>
+          </w:tcPr>
+          <w:p>
+            <w:r/>
+            <w:r>
+              <w:rPr>
+                <w:rFonts w:ascii="Calibri" w:hAnsi="Calibri"/>
+                <w:b/>
+                <w:sz w:val="20"/>
+              </w:rPr>
+              <w:t>Feature Selection</w:t>
+            </w:r>
+          </w:p>
+        </w:tc>
+        <w:tc>
+          <w:tcPr>
+            <w:tcW w:type="dxa" w:w="4533"/>
+            <w:shd w:val="clear" w:color="auto" w:fill="FFFFFF"/>
+          </w:tcPr>
+          <w:p>
+            <w:r/>
+            <w:r>
+              <w:rPr>
+                <w:rFonts w:ascii="Calibri" w:hAnsi="Calibri"/>
+                <w:sz w:val="20"/>
+              </w:rPr>
+              <w:t>SelectKBest with chi-squared statistic, top 30 features selected</w:t>
+            </w:r>
+          </w:p>
+        </w:tc>
+      </w:tr>
+      <w:tr>
+        <w:tc>
+          <w:tcPr>
+            <w:tcW w:type="dxa" w:w="4533"/>
+            <w:shd w:val="clear" w:color="auto" w:fill="FFFFFF"/>
+          </w:tcPr>
+          <w:p>
+            <w:r/>
+            <w:r>
+              <w:rPr>
+                <w:rFonts w:ascii="Calibri" w:hAnsi="Calibri"/>
+                <w:b/>
+                <w:sz w:val="20"/>
+              </w:rPr>
+              <w:t>Scaling</w:t>
+            </w:r>
+          </w:p>
+        </w:tc>
+        <w:tc>
+          <w:tcPr>
+            <w:tcW w:type="dxa" w:w="4533"/>
+            <w:shd w:val="clear" w:color="auto" w:fill="F2F2F2"/>
+          </w:tcPr>
+          <w:p>
+            <w:r/>
+            <w:r>
+              <w:rPr>
+                <w:rFonts w:ascii="Calibri" w:hAnsi="Calibri"/>
+                <w:sz w:val="20"/>
+              </w:rPr>
+              <w:t>MinMaxScaler applied before chi-squared test to ensure non-negative values</w:t>
+            </w:r>
+          </w:p>
+        </w:tc>
+      </w:tr>
+      <w:tr>
+        <w:tc>
+          <w:tcPr>
+            <w:tcW w:type="dxa" w:w="4533"/>
+            <w:shd w:val="clear" w:color="auto" w:fill="F2F2F2"/>
+          </w:tcPr>
+          <w:p>
+            <w:r/>
+            <w:r>
+              <w:rPr>
+                <w:rFonts w:ascii="Calibri" w:hAnsi="Calibri"/>
+                <w:b/>
+                <w:sz w:val="20"/>
+              </w:rPr>
+              <w:t>Train / Val Split</w:t>
+            </w:r>
+          </w:p>
+        </w:tc>
+        <w:tc>
+          <w:tcPr>
+            <w:tcW w:type="dxa" w:w="4533"/>
+            <w:shd w:val="clear" w:color="auto" w:fill="FFFFFF"/>
+          </w:tcPr>
+          <w:p>
+            <w:r/>
+            <w:r>
+              <w:rPr>
+                <w:rFonts w:ascii="Calibri" w:hAnsi="Calibri"/>
+                <w:sz w:val="20"/>
+              </w:rPr>
+              <w:t>80/20 stratified split (random_state=10) → 201 train, 51 validation samples</w:t>
+            </w:r>
+          </w:p>
+        </w:tc>
+      </w:tr>
+      <w:tr>
+        <w:tc>
+          <w:tcPr>
+            <w:tcW w:type="dxa" w:w="4533"/>
+            <w:shd w:val="clear" w:color="auto" w:fill="FFFFFF"/>
+          </w:tcPr>
+          <w:p>
+            <w:r/>
+            <w:r>
+              <w:rPr>
+                <w:rFonts w:ascii="Calibri" w:hAnsi="Calibri"/>
+                <w:b/>
+                <w:sz w:val="20"/>
+              </w:rPr>
+              <w:t>Oversampling</w:t>
+            </w:r>
+          </w:p>
+        </w:tc>
+        <w:tc>
+          <w:tcPr>
+            <w:tcW w:type="dxa" w:w="4533"/>
+            <w:shd w:val="clear" w:color="auto" w:fill="F2F2F2"/>
+          </w:tcPr>
+          <w:p>
+            <w:r/>
+            <w:r>
+              <w:rPr>
+                <w:rFonts w:ascii="Calibri" w:hAnsi="Calibri"/>
+                <w:sz w:val="20"/>
+              </w:rPr>
+              <w:t>RandomOverSampler (strategy=1.0) balances training set → 151 Parkinson / 151 Healthy</w:t>
+            </w:r>
+          </w:p>
+        </w:tc>
+      </w:tr>
+    </w:tbl>
+    <w:p/>
+    <w:p>
+      <w:pPr>
+        <w:spacing w:before="0" w:after="120"/>
+        <w:jc w:val="both"/>
+      </w:pPr>
+      <w:r>
+        <w:rPr>
+          <w:rFonts w:ascii="Calibri" w:hAnsi="Calibri"/>
+          <w:i/>
+          <w:sz w:val="21"/>
+        </w:rPr>
         <w:t>Final selected features (30): tqwt_kurtosisValue_dec_34, tqwt_kurtosisValue_dec_28, tqwt_kurtosisValue_dec_26, tqwt_kurtosisValue_dec_25, tqwt_maxValue_dec_1, tqwt_minValue_dec_12, tqwt_TKEO_mean_dec_32, tqwt_TKEO_mean_dec_13, tqwt_entropy_log_dec_26, tqwt_entropy_shannon_dec_35, tqwt_entropy_shannon_dec_17, tqwt_entropy_shannon_dec_11, tqwt_entropy_shannon_dec_9, tqwt_energy_dec_33, tqwt_energy_dec_31, tqwt_energy_dec_28, tqwt_energy_dec_27, tqwt_energy_dec_26, tqwt_energy_dec_25, tqwt_energy_dec_16, tqwt_energy_dec_14, tqwt_energy_dec_12, tqwt_energy_dec_7, std_MFCC_8th_coef, mean_MFCC_2nd_coef, IMF_SNR_SEO, VFER_mean, f1, DFA, gender</w:t>
       </w:r>
     </w:p>
@@ -216,49 +1125,82 @@
     <w:p>
       <w:pPr>
         <w:pStyle w:val="Heading1"/>
+        <w:spacing w:before="240" w:after="80"/>
         <w:jc w:val="left"/>
       </w:pPr>
       <w:r>
+        <w:rPr>
+          <w:b/>
+          <w:color w:val="1F497D"/>
+          <w:sz w:val="32"/>
+        </w:rPr>
         <w:t>2. Model Development</w:t>
       </w:r>
     </w:p>
     <w:p>
       <w:pPr>
-        <w:jc w:val="left"/>
+        <w:pBdr>
+          <w:bottom w:val="single" w:sz="6" w:space="1" w:color="1F497D"/>
+        </w:pBdr>
+        <w:spacing w:before="80" w:after="80"/>
+      </w:pPr>
+    </w:p>
+    <w:p>
+      <w:pPr>
+        <w:spacing w:before="0" w:after="120"/>
+        <w:jc w:val="both"/>
       </w:pPr>
       <w:r>
-        <w:t>Three traditional ML classifiers were trained on the preprocessed dataset. All training code is modular and reusable (see src/train.py).</w:t>
+        <w:rPr>
+          <w:rFonts w:ascii="Calibri" w:hAnsi="Calibri"/>
+          <w:sz w:val="21"/>
+        </w:rPr>
+        <w:t>Three traditional supervised ML classifiers were trained on the preprocessed dataset. All training code is fully modular — each concern (preprocessing, training, evaluation) is isolated in its own Python module under src/ and can be invoked independently.</w:t>
       </w:r>
     </w:p>
     <w:p>
       <w:pPr>
         <w:pStyle w:val="Heading2"/>
+        <w:spacing w:before="240" w:after="80"/>
         <w:jc w:val="left"/>
       </w:pPr>
       <w:r>
-        <w:t>Models Trained</w:t>
+        <w:rPr>
+          <w:color w:val="1F497D"/>
+          <w:sz w:val="26"/>
+        </w:rPr>
+        <w:t>2.1 Models Trained</w:t>
       </w:r>
     </w:p>
     <w:tbl>
       <w:tblPr>
         <w:tblStyle w:val="TableGrid"/>
         <w:tblW w:type="auto" w:w="0"/>
+        <w:jc w:val="center"/>
         <w:tblLook w:firstColumn="1" w:firstRow="1" w:lastColumn="0" w:lastRow="0" w:noHBand="0" w:noVBand="1" w:val="04A0"/>
       </w:tblPr>
       <w:tblGrid>
-        <w:gridCol w:w="2880"/>
-        <w:gridCol w:w="2880"/>
-        <w:gridCol w:w="2880"/>
+        <w:gridCol w:w="3022"/>
+        <w:gridCol w:w="3022"/>
+        <w:gridCol w:w="3022"/>
       </w:tblGrid>
       <w:tr>
         <w:tc>
           <w:tcPr>
-            <w:tcW w:type="dxa" w:w="2880"/>
+            <w:tcW w:type="dxa" w:w="3022"/>
+            <w:shd w:val="clear" w:color="auto" w:fill="1F497D"/>
           </w:tcPr>
           <w:p>
+            <w:pPr>
+              <w:jc w:val="center"/>
+            </w:pPr>
+            <w:r/>
             <w:r>
               <w:rPr>
+                <w:rFonts w:ascii="Calibri" w:hAnsi="Calibri"/>
                 <w:b/>
+                <w:color w:val="FFFFFF"/>
+                <w:sz w:val="20"/>
               </w:rPr>
               <w:t>Model</w:t>
             </w:r>
@@ -266,12 +1208,20 @@
         </w:tc>
         <w:tc>
           <w:tcPr>
-            <w:tcW w:type="dxa" w:w="2880"/>
+            <w:tcW w:type="dxa" w:w="3022"/>
+            <w:shd w:val="clear" w:color="auto" w:fill="1F497D"/>
           </w:tcPr>
           <w:p>
+            <w:pPr>
+              <w:jc w:val="center"/>
+            </w:pPr>
+            <w:r/>
             <w:r>
               <w:rPr>
+                <w:rFonts w:ascii="Calibri" w:hAnsi="Calibri"/>
                 <w:b/>
+                <w:color w:val="FFFFFF"/>
+                <w:sz w:val="20"/>
               </w:rPr>
               <w:t>Key Parameters</w:t>
             </w:r>
@@ -279,12 +1229,20 @@
         </w:tc>
         <w:tc>
           <w:tcPr>
-            <w:tcW w:type="dxa" w:w="2880"/>
+            <w:tcW w:type="dxa" w:w="3022"/>
+            <w:shd w:val="clear" w:color="auto" w:fill="1F497D"/>
           </w:tcPr>
           <w:p>
+            <w:pPr>
+              <w:jc w:val="center"/>
+            </w:pPr>
+            <w:r/>
             <w:r>
               <w:rPr>
+                <w:rFonts w:ascii="Calibri" w:hAnsi="Calibri"/>
                 <w:b/>
+                <w:color w:val="FFFFFF"/>
+                <w:sz w:val="20"/>
               </w:rPr>
               <w:t>Rationale</w:t>
             </w:r>
@@ -294,31 +1252,51 @@
       <w:tr>
         <w:tc>
           <w:tcPr>
-            <w:tcW w:type="dxa" w:w="2880"/>
+            <w:tcW w:type="dxa" w:w="3022"/>
+            <w:shd w:val="clear" w:color="auto" w:fill="F2F2F2"/>
           </w:tcPr>
           <w:p>
+            <w:r/>
             <w:r>
+              <w:rPr>
+                <w:rFonts w:ascii="Calibri" w:hAnsi="Calibri"/>
+                <w:sz w:val="20"/>
+              </w:rPr>
               <w:t>Logistic Regression</w:t>
             </w:r>
           </w:p>
         </w:tc>
         <w:tc>
           <w:tcPr>
-            <w:tcW w:type="dxa" w:w="2880"/>
+            <w:tcW w:type="dxa" w:w="3022"/>
+            <w:shd w:val="clear" w:color="auto" w:fill="F2F2F2"/>
           </w:tcPr>
           <w:p>
+            <w:r/>
             <w:r>
-              <w:t>class_weight=balanced, max_iter=1000</w:t>
+              <w:rPr>
+                <w:rFonts w:ascii="Calibri" w:hAnsi="Calibri"/>
+                <w:sz w:val="20"/>
+              </w:rPr>
+              <w:t>class_weight=balanced</w:t>
+              <w:br/>
+              <w:t>max_iter=1000</w:t>
             </w:r>
           </w:p>
         </w:tc>
         <w:tc>
           <w:tcPr>
-            <w:tcW w:type="dxa" w:w="2880"/>
+            <w:tcW w:type="dxa" w:w="3022"/>
+            <w:shd w:val="clear" w:color="auto" w:fill="F2F2F2"/>
           </w:tcPr>
           <w:p>
+            <w:r/>
             <w:r>
-              <w:t>Interpretable linear baseline; calibrated probabilities</w:t>
+              <w:rPr>
+                <w:rFonts w:ascii="Calibri" w:hAnsi="Calibri"/>
+                <w:sz w:val="20"/>
+              </w:rPr>
+              <w:t>Interpretable linear baseline; calibrated probabilities; suitable for small datasets</w:t>
             </w:r>
           </w:p>
         </w:tc>
@@ -326,31 +1304,51 @@
       <w:tr>
         <w:tc>
           <w:tcPr>
-            <w:tcW w:type="dxa" w:w="2880"/>
+            <w:tcW w:type="dxa" w:w="3022"/>
+            <w:shd w:val="clear" w:color="auto" w:fill="FFFFFF"/>
           </w:tcPr>
           <w:p>
+            <w:r/>
             <w:r>
+              <w:rPr>
+                <w:rFonts w:ascii="Calibri" w:hAnsi="Calibri"/>
+                <w:sz w:val="20"/>
+              </w:rPr>
               <w:t>Random Forest</w:t>
             </w:r>
           </w:p>
         </w:tc>
         <w:tc>
           <w:tcPr>
-            <w:tcW w:type="dxa" w:w="2880"/>
+            <w:tcW w:type="dxa" w:w="3022"/>
+            <w:shd w:val="clear" w:color="auto" w:fill="FFFFFF"/>
           </w:tcPr>
           <w:p>
+            <w:r/>
             <w:r>
-              <w:t>n_estimators=100, class_weight=balanced</w:t>
+              <w:rPr>
+                <w:rFonts w:ascii="Calibri" w:hAnsi="Calibri"/>
+                <w:sz w:val="20"/>
+              </w:rPr>
+              <w:t>n_estimators=100</w:t>
+              <w:br/>
+              <w:t>class_weight=balanced</w:t>
             </w:r>
           </w:p>
         </w:tc>
         <w:tc>
           <w:tcPr>
-            <w:tcW w:type="dxa" w:w="2880"/>
+            <w:tcW w:type="dxa" w:w="3022"/>
+            <w:shd w:val="clear" w:color="auto" w:fill="FFFFFF"/>
           </w:tcPr>
           <w:p>
+            <w:r/>
             <w:r>
-              <w:t>Non-linear ensemble; robust to outliers; native feature importance</w:t>
+              <w:rPr>
+                <w:rFonts w:ascii="Calibri" w:hAnsi="Calibri"/>
+                <w:sz w:val="20"/>
+              </w:rPr>
+              <w:t>Non-linear ensemble; robust to outliers; built-in feature importance</w:t>
             </w:r>
           </w:p>
         </w:tc>
@@ -358,31 +1356,51 @@
       <w:tr>
         <w:tc>
           <w:tcPr>
-            <w:tcW w:type="dxa" w:w="2880"/>
+            <w:tcW w:type="dxa" w:w="3022"/>
+            <w:shd w:val="clear" w:color="auto" w:fill="F2F2F2"/>
           </w:tcPr>
           <w:p>
+            <w:r/>
             <w:r>
+              <w:rPr>
+                <w:rFonts w:ascii="Calibri" w:hAnsi="Calibri"/>
+                <w:sz w:val="20"/>
+              </w:rPr>
               <w:t>XGBoost</w:t>
             </w:r>
           </w:p>
         </w:tc>
         <w:tc>
           <w:tcPr>
-            <w:tcW w:type="dxa" w:w="2880"/>
+            <w:tcW w:type="dxa" w:w="3022"/>
+            <w:shd w:val="clear" w:color="auto" w:fill="F2F2F2"/>
           </w:tcPr>
           <w:p>
+            <w:r/>
             <w:r>
-              <w:t>n_estimators=100, eval_metric=logloss</w:t>
+              <w:rPr>
+                <w:rFonts w:ascii="Calibri" w:hAnsi="Calibri"/>
+                <w:sz w:val="20"/>
+              </w:rPr>
+              <w:t>n_estimators=100</w:t>
+              <w:br/>
+              <w:t>eval_metric=logloss</w:t>
             </w:r>
           </w:p>
         </w:tc>
         <w:tc>
           <w:tcPr>
-            <w:tcW w:type="dxa" w:w="2880"/>
+            <w:tcW w:type="dxa" w:w="3022"/>
+            <w:shd w:val="clear" w:color="auto" w:fill="F2F2F2"/>
           </w:tcPr>
           <w:p>
+            <w:r/>
             <w:r>
-              <w:t>Gradient boosted trees; typically strong on tabular data</w:t>
+              <w:rPr>
+                <w:rFonts w:ascii="Calibri" w:hAnsi="Calibri"/>
+                <w:sz w:val="20"/>
+              </w:rPr>
+              <w:t>Gradient boosted trees; high performance on tabular data</w:t>
             </w:r>
           </w:p>
         </w:tc>
@@ -392,29 +1410,115 @@
     <w:p>
       <w:pPr>
         <w:pStyle w:val="Heading2"/>
+        <w:spacing w:before="240" w:after="80"/>
         <w:jc w:val="left"/>
       </w:pPr>
       <w:r>
-        <w:t>Training Pipeline</w:t>
+        <w:rPr>
+          <w:color w:val="1F497D"/>
+          <w:sz w:val="26"/>
+        </w:rPr>
+        <w:t>2.2 Project Structure</w:t>
       </w:r>
     </w:p>
     <w:p>
       <w:pPr>
+        <w:pStyle w:val="ListBullet"/>
+        <w:spacing w:before="0" w:after="60"/>
+      </w:pPr>
+      <w:r>
+        <w:rPr>
+          <w:rFonts w:ascii="Calibri" w:hAnsi="Calibri"/>
+          <w:sz w:val="21"/>
+        </w:rPr>
+        <w:t>src/data_preprocessing.py  — load, EDA, correlation filter, SelectKBest, split, oversample</w:t>
+      </w:r>
+    </w:p>
+    <w:p>
+      <w:pPr>
+        <w:pStyle w:val="ListBullet"/>
+        <w:spacing w:before="0" w:after="60"/>
+      </w:pPr>
+      <w:r>
+        <w:rPr>
+          <w:rFonts w:ascii="Calibri" w:hAnsi="Calibri"/>
+          <w:sz w:val="21"/>
+        </w:rPr>
+        <w:t>src/train.py               — model registry (get_models), train_model(), save_model(), CLI</w:t>
+      </w:r>
+    </w:p>
+    <w:p>
+      <w:pPr>
+        <w:pStyle w:val="ListBullet"/>
+        <w:spacing w:before="0" w:after="60"/>
+      </w:pPr>
+      <w:r>
+        <w:rPr>
+          <w:rFonts w:ascii="Calibri" w:hAnsi="Calibri"/>
+          <w:sz w:val="21"/>
+        </w:rPr>
+        <w:t>src/evaluate.py            — evaluate_model(), plot_confusion_matrix(), plot_shap(), CLI</w:t>
+      </w:r>
+    </w:p>
+    <w:p>
+      <w:pPr>
+        <w:pStyle w:val="ListBullet"/>
+        <w:spacing w:before="0" w:after="60"/>
+      </w:pPr>
+      <w:r>
+        <w:rPr>
+          <w:rFonts w:ascii="Calibri" w:hAnsi="Calibri"/>
+          <w:sz w:val="21"/>
+        </w:rPr>
+        <w:t>src/generate_report.py     — this report generator</w:t>
+      </w:r>
+    </w:p>
+    <w:p>
+      <w:pPr>
+        <w:pStyle w:val="ListBullet"/>
+        <w:spacing w:before="0" w:after="60"/>
+      </w:pPr>
+      <w:r>
+        <w:rPr>
+          <w:rFonts w:ascii="Calibri" w:hAnsi="Calibri"/>
+          <w:sz w:val="21"/>
+        </w:rPr>
+        <w:t>app/main.py                — FastAPI REST API with /predict, /features, /models endpoints</w:t>
+      </w:r>
+    </w:p>
+    <w:p/>
+    <w:p>
+      <w:pPr>
+        <w:pStyle w:val="Heading2"/>
+        <w:spacing w:before="240" w:after="80"/>
         <w:jc w:val="left"/>
       </w:pPr>
       <w:r>
-        <w:t>• src/data_preprocessing.py — load, EDA, correlation filter, SelectKBest, split, oversample</w:t>
+        <w:rPr>
+          <w:color w:val="1F497D"/>
+          <w:sz w:val="26"/>
+        </w:rPr>
+        <w:t>2.3 Training Command</w:t>
+      </w:r>
+    </w:p>
+    <w:p>
+      <w:pPr>
+        <w:shd w:val="clear" w:color="auto" w:fill="F2F2F2"/>
+        <w:spacing w:before="80" w:after="80"/>
+      </w:pPr>
+      <w:r>
+        <w:rPr>
+          <w:rFonts w:ascii="Courier New" w:hAnsi="Courier New"/>
+          <w:sz w:val="18"/>
+        </w:rPr>
+        <w:t># Train all models</w:t>
         <w:br/>
-        <w:t>• src/train.py — model registry, fit, pickle save; supports --model flag for individual training</w:t>
-        <w:br/>
-        <w:t>• src/evaluate.py — metrics, confusion matrix, feature importance, SHAP plots</w:t>
-        <w:br/>
-        <w:t>• app/main.py — FastAPI serving with /predict endpoint</w:t>
+        <w:t>python src/train.py --data_path dataset/parkinson_disease.csv --seed 42</w:t>
         <w:br/>
         <w:br/>
-        <w:t>Run command:</w:t>
+        <w:t># Train a specific model</w:t>
         <w:br/>
-        <w:t xml:space="preserve">  python src/train.py --data_path dataset/parkinson_disease.csv --seed 42</w:t>
+        <w:t>python src/train.py --data_path dataset/parkinson_disease.csv --model logistic_regression --seed 42</w:t>
       </w:r>
     </w:p>
     <w:p>
@@ -425,50 +1529,83 @@
     <w:p>
       <w:pPr>
         <w:pStyle w:val="Heading1"/>
+        <w:spacing w:before="240" w:after="80"/>
         <w:jc w:val="left"/>
       </w:pPr>
       <w:r>
-        <w:t>3. Model Evaluation &amp; Explainability</w:t>
+        <w:rPr>
+          <w:b/>
+          <w:color w:val="1F497D"/>
+          <w:sz w:val="32"/>
+        </w:rPr>
+        <w:t>3. Model Evaluation &amp; Metrics</w:t>
       </w:r>
     </w:p>
     <w:p>
       <w:pPr>
-        <w:pStyle w:val="Heading2"/>
-        <w:jc w:val="left"/>
+        <w:pBdr>
+          <w:bottom w:val="single" w:sz="6" w:space="1" w:color="1F497D"/>
+        </w:pBdr>
+        <w:spacing w:before="80" w:after="80"/>
+      </w:pPr>
+    </w:p>
+    <w:p>
+      <w:pPr>
+        <w:spacing w:before="0" w:after="120"/>
+        <w:jc w:val="both"/>
       </w:pPr>
       <w:r>
-        <w:t>3.1 Performance Metrics</w:t>
+        <w:rPr>
+          <w:rFonts w:ascii="Calibri" w:hAnsi="Calibri"/>
+          <w:sz w:val="21"/>
+        </w:rPr>
+        <w:t>All models are evaluated on the held-out 20% validation set (51 patients). Three standard classification metrics are reported: Accuracy (overall correct predictions), F1 Score (harmonic mean of precision and recall, weighted toward Parkinson class), and ROC-AUC (area under the receiver operating characteristic curve — the primary metric for imbalanced clinical classification tasks).</w:t>
       </w:r>
     </w:p>
     <w:p>
       <w:pPr>
+        <w:pStyle w:val="Heading2"/>
+        <w:spacing w:before="240" w:after="80"/>
         <w:jc w:val="left"/>
       </w:pPr>
       <w:r>
-        <w:t>All models evaluated on the held-out 20% validation set (51 patients). Metrics: Accuracy, F1 Score (weighted toward Parkinson class), ROC-AUC.</w:t>
+        <w:rPr>
+          <w:color w:val="1F497D"/>
+          <w:sz w:val="26"/>
+        </w:rPr>
+        <w:t>3.1 Performance Summary</w:t>
       </w:r>
     </w:p>
     <w:tbl>
       <w:tblPr>
         <w:tblStyle w:val="TableGrid"/>
         <w:tblW w:type="auto" w:w="0"/>
+        <w:jc w:val="center"/>
         <w:tblLook w:firstColumn="1" w:firstRow="1" w:lastColumn="0" w:lastRow="0" w:noHBand="0" w:noVBand="1" w:val="04A0"/>
       </w:tblPr>
       <w:tblGrid>
-        <w:gridCol w:w="2160"/>
-        <w:gridCol w:w="2160"/>
-        <w:gridCol w:w="2160"/>
-        <w:gridCol w:w="2160"/>
+        <w:gridCol w:w="2266"/>
+        <w:gridCol w:w="2266"/>
+        <w:gridCol w:w="2266"/>
+        <w:gridCol w:w="2266"/>
       </w:tblGrid>
       <w:tr>
         <w:tc>
           <w:tcPr>
-            <w:tcW w:type="dxa" w:w="2160"/>
+            <w:tcW w:type="dxa" w:w="2266"/>
+            <w:shd w:val="clear" w:color="auto" w:fill="1F497D"/>
           </w:tcPr>
           <w:p>
+            <w:pPr>
+              <w:jc w:val="center"/>
+            </w:pPr>
+            <w:r/>
             <w:r>
               <w:rPr>
+                <w:rFonts w:ascii="Calibri" w:hAnsi="Calibri"/>
                 <w:b/>
+                <w:color w:val="FFFFFF"/>
+                <w:sz w:val="20"/>
               </w:rPr>
               <w:t>Model</w:t>
             </w:r>
@@ -476,12 +1613,20 @@
         </w:tc>
         <w:tc>
           <w:tcPr>
-            <w:tcW w:type="dxa" w:w="2160"/>
+            <w:tcW w:type="dxa" w:w="2266"/>
+            <w:shd w:val="clear" w:color="auto" w:fill="1F497D"/>
           </w:tcPr>
           <w:p>
+            <w:pPr>
+              <w:jc w:val="center"/>
+            </w:pPr>
+            <w:r/>
             <w:r>
               <w:rPr>
+                <w:rFonts w:ascii="Calibri" w:hAnsi="Calibri"/>
                 <w:b/>
+                <w:color w:val="FFFFFF"/>
+                <w:sz w:val="20"/>
               </w:rPr>
               <w:t>Accuracy</w:t>
             </w:r>
@@ -489,12 +1634,20 @@
         </w:tc>
         <w:tc>
           <w:tcPr>
-            <w:tcW w:type="dxa" w:w="2160"/>
+            <w:tcW w:type="dxa" w:w="2266"/>
+            <w:shd w:val="clear" w:color="auto" w:fill="1F497D"/>
           </w:tcPr>
           <w:p>
+            <w:pPr>
+              <w:jc w:val="center"/>
+            </w:pPr>
+            <w:r/>
             <w:r>
               <w:rPr>
+                <w:rFonts w:ascii="Calibri" w:hAnsi="Calibri"/>
                 <w:b/>
+                <w:color w:val="FFFFFF"/>
+                <w:sz w:val="20"/>
               </w:rPr>
               <w:t>F1 Score</w:t>
             </w:r>
@@ -502,12 +1655,20 @@
         </w:tc>
         <w:tc>
           <w:tcPr>
-            <w:tcW w:type="dxa" w:w="2160"/>
+            <w:tcW w:type="dxa" w:w="2266"/>
+            <w:shd w:val="clear" w:color="auto" w:fill="1F497D"/>
           </w:tcPr>
           <w:p>
+            <w:pPr>
+              <w:jc w:val="center"/>
+            </w:pPr>
+            <w:r/>
             <w:r>
               <w:rPr>
+                <w:rFonts w:ascii="Calibri" w:hAnsi="Calibri"/>
                 <w:b/>
+                <w:color w:val="FFFFFF"/>
+                <w:sz w:val="20"/>
               </w:rPr>
               <w:t>ROC-AUC</w:t>
             </w:r>
@@ -517,40 +1678,80 @@
       <w:tr>
         <w:tc>
           <w:tcPr>
-            <w:tcW w:type="dxa" w:w="2160"/>
+            <w:tcW w:type="dxa" w:w="2266"/>
+            <w:shd w:val="clear" w:color="auto" w:fill="F2F2F2"/>
           </w:tcPr>
           <w:p>
+            <w:pPr>
+              <w:jc w:val="center"/>
+            </w:pPr>
+            <w:r/>
             <w:r>
+              <w:rPr>
+                <w:rFonts w:ascii="Calibri" w:hAnsi="Calibri"/>
+                <w:b/>
+                <w:sz w:val="20"/>
+              </w:rPr>
               <w:t>Random Forest</w:t>
             </w:r>
           </w:p>
         </w:tc>
         <w:tc>
           <w:tcPr>
-            <w:tcW w:type="dxa" w:w="2160"/>
+            <w:tcW w:type="dxa" w:w="2266"/>
+            <w:shd w:val="clear" w:color="auto" w:fill="F2F2F2"/>
           </w:tcPr>
           <w:p>
+            <w:pPr>
+              <w:jc w:val="center"/>
+            </w:pPr>
+            <w:r/>
             <w:r>
+              <w:rPr>
+                <w:rFonts w:ascii="Calibri" w:hAnsi="Calibri"/>
+                <w:b/>
+                <w:sz w:val="20"/>
+              </w:rPr>
               <w:t>0.8431</w:t>
             </w:r>
           </w:p>
         </w:tc>
         <w:tc>
           <w:tcPr>
-            <w:tcW w:type="dxa" w:w="2160"/>
+            <w:tcW w:type="dxa" w:w="2266"/>
+            <w:shd w:val="clear" w:color="auto" w:fill="F2F2F2"/>
           </w:tcPr>
           <w:p>
+            <w:pPr>
+              <w:jc w:val="center"/>
+            </w:pPr>
+            <w:r/>
             <w:r>
+              <w:rPr>
+                <w:rFonts w:ascii="Calibri" w:hAnsi="Calibri"/>
+                <w:b/>
+                <w:sz w:val="20"/>
+              </w:rPr>
               <w:t>0.8974</w:t>
             </w:r>
           </w:p>
         </w:tc>
         <w:tc>
           <w:tcPr>
-            <w:tcW w:type="dxa" w:w="2160"/>
+            <w:tcW w:type="dxa" w:w="2266"/>
+            <w:shd w:val="clear" w:color="auto" w:fill="F2F2F2"/>
           </w:tcPr>
           <w:p>
+            <w:pPr>
+              <w:jc w:val="center"/>
+            </w:pPr>
+            <w:r/>
             <w:r>
+              <w:rPr>
+                <w:rFonts w:ascii="Calibri" w:hAnsi="Calibri"/>
+                <w:b/>
+                <w:sz w:val="20"/>
+              </w:rPr>
               <w:t>0.8156</w:t>
             </w:r>
           </w:p>
@@ -559,40 +1760,76 @@
       <w:tr>
         <w:tc>
           <w:tcPr>
-            <w:tcW w:type="dxa" w:w="2160"/>
+            <w:tcW w:type="dxa" w:w="2266"/>
+            <w:shd w:val="clear" w:color="auto" w:fill="FFFFFF"/>
           </w:tcPr>
           <w:p>
+            <w:pPr>
+              <w:jc w:val="center"/>
+            </w:pPr>
+            <w:r/>
             <w:r>
+              <w:rPr>
+                <w:rFonts w:ascii="Calibri" w:hAnsi="Calibri"/>
+                <w:sz w:val="20"/>
+              </w:rPr>
               <w:t>Logistic Regression</w:t>
             </w:r>
           </w:p>
         </w:tc>
         <w:tc>
           <w:tcPr>
-            <w:tcW w:type="dxa" w:w="2160"/>
+            <w:tcW w:type="dxa" w:w="2266"/>
+            <w:shd w:val="clear" w:color="auto" w:fill="FFFFFF"/>
           </w:tcPr>
           <w:p>
+            <w:pPr>
+              <w:jc w:val="center"/>
+            </w:pPr>
+            <w:r/>
             <w:r>
+              <w:rPr>
+                <w:rFonts w:ascii="Calibri" w:hAnsi="Calibri"/>
+                <w:sz w:val="20"/>
+              </w:rPr>
               <w:t>0.8235</w:t>
             </w:r>
           </w:p>
         </w:tc>
         <w:tc>
           <w:tcPr>
-            <w:tcW w:type="dxa" w:w="2160"/>
+            <w:tcW w:type="dxa" w:w="2266"/>
+            <w:shd w:val="clear" w:color="auto" w:fill="FFFFFF"/>
           </w:tcPr>
           <w:p>
+            <w:pPr>
+              <w:jc w:val="center"/>
+            </w:pPr>
+            <w:r/>
             <w:r>
+              <w:rPr>
+                <w:rFonts w:ascii="Calibri" w:hAnsi="Calibri"/>
+                <w:sz w:val="20"/>
+              </w:rPr>
               <w:t>0.8767</w:t>
             </w:r>
           </w:p>
         </w:tc>
         <w:tc>
           <w:tcPr>
-            <w:tcW w:type="dxa" w:w="2160"/>
+            <w:tcW w:type="dxa" w:w="2266"/>
+            <w:shd w:val="clear" w:color="auto" w:fill="FFFFFF"/>
           </w:tcPr>
           <w:p>
+            <w:pPr>
+              <w:jc w:val="center"/>
+            </w:pPr>
+            <w:r/>
             <w:r>
+              <w:rPr>
+                <w:rFonts w:ascii="Calibri" w:hAnsi="Calibri"/>
+                <w:sz w:val="20"/>
+              </w:rPr>
               <w:t>0.7992</w:t>
             </w:r>
           </w:p>
@@ -601,40 +1838,76 @@
       <w:tr>
         <w:tc>
           <w:tcPr>
-            <w:tcW w:type="dxa" w:w="2160"/>
+            <w:tcW w:type="dxa" w:w="2266"/>
+            <w:shd w:val="clear" w:color="auto" w:fill="F2F2F2"/>
           </w:tcPr>
           <w:p>
+            <w:pPr>
+              <w:jc w:val="center"/>
+            </w:pPr>
+            <w:r/>
             <w:r>
+              <w:rPr>
+                <w:rFonts w:ascii="Calibri" w:hAnsi="Calibri"/>
+                <w:sz w:val="20"/>
+              </w:rPr>
               <w:t>Xgboost</w:t>
             </w:r>
           </w:p>
         </w:tc>
         <w:tc>
           <w:tcPr>
-            <w:tcW w:type="dxa" w:w="2160"/>
+            <w:tcW w:type="dxa" w:w="2266"/>
+            <w:shd w:val="clear" w:color="auto" w:fill="F2F2F2"/>
           </w:tcPr>
           <w:p>
+            <w:pPr>
+              <w:jc w:val="center"/>
+            </w:pPr>
+            <w:r/>
             <w:r>
+              <w:rPr>
+                <w:rFonts w:ascii="Calibri" w:hAnsi="Calibri"/>
+                <w:sz w:val="20"/>
+              </w:rPr>
               <w:t>0.7451</w:t>
             </w:r>
           </w:p>
         </w:tc>
         <w:tc>
           <w:tcPr>
-            <w:tcW w:type="dxa" w:w="2160"/>
+            <w:tcW w:type="dxa" w:w="2266"/>
+            <w:shd w:val="clear" w:color="auto" w:fill="F2F2F2"/>
           </w:tcPr>
           <w:p>
+            <w:pPr>
+              <w:jc w:val="center"/>
+            </w:pPr>
+            <w:r/>
             <w:r>
+              <w:rPr>
+                <w:rFonts w:ascii="Calibri" w:hAnsi="Calibri"/>
+                <w:sz w:val="20"/>
+              </w:rPr>
               <w:t>0.8312</w:t>
             </w:r>
           </w:p>
         </w:tc>
         <w:tc>
           <w:tcPr>
-            <w:tcW w:type="dxa" w:w="2160"/>
+            <w:tcW w:type="dxa" w:w="2266"/>
+            <w:shd w:val="clear" w:color="auto" w:fill="F2F2F2"/>
           </w:tcPr>
           <w:p>
+            <w:pPr>
+              <w:jc w:val="center"/>
+            </w:pPr>
+            <w:r/>
             <w:r>
+              <w:rPr>
+                <w:rFonts w:ascii="Calibri" w:hAnsi="Calibri"/>
+                <w:sz w:val="20"/>
+              </w:rPr>
               <w:t>0.7857</w:t>
             </w:r>
           </w:p>
@@ -644,11 +1917,16 @@
     <w:p/>
     <w:p>
       <w:pPr>
-        <w:pStyle w:val="Heading3"/>
-        <w:jc w:val="left"/>
+        <w:spacing w:before="0" w:after="120"/>
+        <w:jc w:val="both"/>
       </w:pPr>
       <w:r>
-        <w:t>Model Comparison Chart</w:t>
+        <w:rPr>
+          <w:rFonts w:ascii="Calibri" w:hAnsi="Calibri"/>
+          <w:i/>
+          <w:sz w:val="21"/>
+        </w:rPr>
+        <w:t>Bold row = best ROC-AUC. Run command: python src/evaluate.py --data_path dataset/parkinson_disease.csv</w:t>
       </w:r>
     </w:p>
     <w:p>
@@ -658,7 +1936,7 @@
       <w:r>
         <w:drawing>
           <wp:inline xmlns:a="http://schemas.openxmlformats.org/drawingml/2006/main" xmlns:pic="http://schemas.openxmlformats.org/drawingml/2006/picture">
-            <wp:extent cx="5029200" cy="3109068"/>
+            <wp:extent cx="5303520" cy="3278654"/>
             <wp:docPr id="3" name="Picture 3"/>
             <wp:cNvGraphicFramePr>
               <a:graphicFrameLocks noChangeAspect="1"/>
@@ -679,7 +1957,7 @@
                   <pic:spPr>
                     <a:xfrm>
                       <a:off x="0" y="0"/>
-                      <a:ext cx="5029200" cy="3109068"/>
+                      <a:ext cx="5303520" cy="3278654"/>
                     </a:xfrm>
                     <a:prstGeom prst="rect"/>
                   </pic:spPr>
@@ -692,15 +1970,42 @@
     </w:p>
     <w:p>
       <w:pPr>
+        <w:spacing w:before="40" w:after="200"/>
+        <w:jc w:val="center"/>
+      </w:pPr>
+      <w:r>
+        <w:rPr>
+          <w:i/>
+          <w:color w:val="666666"/>
+          <w:sz w:val="18"/>
+        </w:rPr>
+        <w:t>Figure 3 — Side-by-side comparison of Accuracy, F1, and ROC-AUC across all models</w:t>
+      </w:r>
+    </w:p>
+    <w:p>
+      <w:pPr>
         <w:pStyle w:val="Heading2"/>
+        <w:spacing w:before="240" w:after="80"/>
         <w:jc w:val="left"/>
       </w:pPr>
       <w:r>
+        <w:rPr>
+          <w:color w:val="1F497D"/>
+          <w:sz w:val="26"/>
+        </w:rPr>
         <w:t>3.2 Classification Reports</w:t>
       </w:r>
     </w:p>
     <w:p>
+      <w:pPr>
+        <w:spacing w:before="0" w:after="120"/>
+        <w:jc w:val="both"/>
+      </w:pPr>
       <w:r>
+        <w:rPr>
+          <w:rFonts w:ascii="Calibri" w:hAnsi="Calibri"/>
+          <w:sz w:val="21"/>
+        </w:rPr>
         <w:t>Classification Report — Random Forest:</w:t>
       </w:r>
     </w:p>
@@ -711,7 +2016,7 @@
       <w:r>
         <w:rPr>
           <w:rFonts w:ascii="Courier New" w:hAnsi="Courier New"/>
-          <w:sz w:val="16"/>
+          <w:sz w:val="17"/>
         </w:rPr>
         <w:t>precision    recall  f1-score   support</w:t>
       </w:r>
@@ -723,7 +2028,7 @@
       <w:r>
         <w:rPr>
           <w:rFonts w:ascii="Courier New" w:hAnsi="Courier New"/>
-          <w:sz w:val="16"/>
+          <w:sz w:val="17"/>
         </w:rPr>
         <w:t xml:space="preserve">     Healthy       0.80      0.57      0.67        14</w:t>
       </w:r>
@@ -735,7 +2040,7 @@
       <w:r>
         <w:rPr>
           <w:rFonts w:ascii="Courier New" w:hAnsi="Courier New"/>
-          <w:sz w:val="16"/>
+          <w:sz w:val="17"/>
         </w:rPr>
         <w:t xml:space="preserve">   Parkinson       0.85      0.95      0.90        37</w:t>
       </w:r>
@@ -747,7 +2052,7 @@
       <w:r>
         <w:rPr>
           <w:rFonts w:ascii="Courier New" w:hAnsi="Courier New"/>
-          <w:sz w:val="16"/>
+          <w:sz w:val="17"/>
         </w:rPr>
         <w:t xml:space="preserve">    accuracy                           0.84        51</w:t>
       </w:r>
@@ -759,7 +2064,7 @@
       <w:r>
         <w:rPr>
           <w:rFonts w:ascii="Courier New" w:hAnsi="Courier New"/>
-          <w:sz w:val="16"/>
+          <w:sz w:val="17"/>
         </w:rPr>
         <w:t xml:space="preserve">   macro avg       0.83      0.76      0.78        51</w:t>
       </w:r>
@@ -771,14 +2076,22 @@
       <w:r>
         <w:rPr>
           <w:rFonts w:ascii="Courier New" w:hAnsi="Courier New"/>
-          <w:sz w:val="16"/>
+          <w:sz w:val="17"/>
         </w:rPr>
         <w:t>weighted avg       0.84      0.84      0.83        51</w:t>
       </w:r>
     </w:p>
     <w:p/>
     <w:p>
+      <w:pPr>
+        <w:spacing w:before="0" w:after="120"/>
+        <w:jc w:val="both"/>
+      </w:pPr>
       <w:r>
+        <w:rPr>
+          <w:rFonts w:ascii="Calibri" w:hAnsi="Calibri"/>
+          <w:sz w:val="21"/>
+        </w:rPr>
         <w:t>Classification Report — Logistic Regression:</w:t>
       </w:r>
     </w:p>
@@ -789,7 +2102,7 @@
       <w:r>
         <w:rPr>
           <w:rFonts w:ascii="Courier New" w:hAnsi="Courier New"/>
-          <w:sz w:val="16"/>
+          <w:sz w:val="17"/>
         </w:rPr>
         <w:t>precision    recall  f1-score   support</w:t>
       </w:r>
@@ -801,7 +2114,7 @@
       <w:r>
         <w:rPr>
           <w:rFonts w:ascii="Courier New" w:hAnsi="Courier New"/>
-          <w:sz w:val="16"/>
+          <w:sz w:val="17"/>
         </w:rPr>
         <w:t xml:space="preserve">     Healthy       0.67      0.71      0.69        14</w:t>
       </w:r>
@@ -813,7 +2126,7 @@
       <w:r>
         <w:rPr>
           <w:rFonts w:ascii="Courier New" w:hAnsi="Courier New"/>
-          <w:sz w:val="16"/>
+          <w:sz w:val="17"/>
         </w:rPr>
         <w:t xml:space="preserve">   Parkinson       0.89      0.86      0.88        37</w:t>
       </w:r>
@@ -825,7 +2138,7 @@
       <w:r>
         <w:rPr>
           <w:rFonts w:ascii="Courier New" w:hAnsi="Courier New"/>
-          <w:sz w:val="16"/>
+          <w:sz w:val="17"/>
         </w:rPr>
         <w:t xml:space="preserve">    accuracy                           0.82        51</w:t>
       </w:r>
@@ -837,7 +2150,7 @@
       <w:r>
         <w:rPr>
           <w:rFonts w:ascii="Courier New" w:hAnsi="Courier New"/>
-          <w:sz w:val="16"/>
+          <w:sz w:val="17"/>
         </w:rPr>
         <w:t xml:space="preserve">   macro avg       0.78      0.79      0.78        51</w:t>
       </w:r>
@@ -849,14 +2162,22 @@
       <w:r>
         <w:rPr>
           <w:rFonts w:ascii="Courier New" w:hAnsi="Courier New"/>
-          <w:sz w:val="16"/>
+          <w:sz w:val="17"/>
         </w:rPr>
         <w:t>weighted avg       0.83      0.82      0.83        51</w:t>
       </w:r>
     </w:p>
     <w:p/>
     <w:p>
+      <w:pPr>
+        <w:spacing w:before="0" w:after="120"/>
+        <w:jc w:val="both"/>
+      </w:pPr>
       <w:r>
+        <w:rPr>
+          <w:rFonts w:ascii="Calibri" w:hAnsi="Calibri"/>
+          <w:sz w:val="21"/>
+        </w:rPr>
         <w:t>Classification Report — Xgboost:</w:t>
       </w:r>
     </w:p>
@@ -867,7 +2188,7 @@
       <w:r>
         <w:rPr>
           <w:rFonts w:ascii="Courier New" w:hAnsi="Courier New"/>
-          <w:sz w:val="16"/>
+          <w:sz w:val="17"/>
         </w:rPr>
         <w:t>precision    recall  f1-score   support</w:t>
       </w:r>
@@ -879,7 +2200,7 @@
       <w:r>
         <w:rPr>
           <w:rFonts w:ascii="Courier New" w:hAnsi="Courier New"/>
-          <w:sz w:val="16"/>
+          <w:sz w:val="17"/>
         </w:rPr>
         <w:t xml:space="preserve">     Healthy       0.55      0.43      0.48        14</w:t>
       </w:r>
@@ -891,7 +2212,7 @@
       <w:r>
         <w:rPr>
           <w:rFonts w:ascii="Courier New" w:hAnsi="Courier New"/>
-          <w:sz w:val="16"/>
+          <w:sz w:val="17"/>
         </w:rPr>
         <w:t xml:space="preserve">   Parkinson       0.80      0.86      0.83        37</w:t>
       </w:r>
@@ -903,7 +2224,7 @@
       <w:r>
         <w:rPr>
           <w:rFonts w:ascii="Courier New" w:hAnsi="Courier New"/>
-          <w:sz w:val="16"/>
+          <w:sz w:val="17"/>
         </w:rPr>
         <w:t xml:space="preserve">    accuracy                           0.75        51</w:t>
       </w:r>
@@ -915,7 +2236,7 @@
       <w:r>
         <w:rPr>
           <w:rFonts w:ascii="Courier New" w:hAnsi="Courier New"/>
-          <w:sz w:val="16"/>
+          <w:sz w:val="17"/>
         </w:rPr>
         <w:t xml:space="preserve">   macro avg       0.67      0.65      0.66        51</w:t>
       </w:r>
@@ -927,7 +2248,7 @@
       <w:r>
         <w:rPr>
           <w:rFonts w:ascii="Courier New" w:hAnsi="Courier New"/>
-          <w:sz w:val="16"/>
+          <w:sz w:val="17"/>
         </w:rPr>
         <w:t>weighted avg       0.73      0.75      0.73        51</w:t>
       </w:r>
@@ -936,19 +2257,28 @@
     <w:p>
       <w:pPr>
         <w:pStyle w:val="Heading2"/>
+        <w:spacing w:before="240" w:after="80"/>
         <w:jc w:val="left"/>
       </w:pPr>
       <w:r>
+        <w:rPr>
+          <w:color w:val="1F497D"/>
+          <w:sz w:val="26"/>
+        </w:rPr>
         <w:t>3.3 Confusion Matrices</w:t>
       </w:r>
     </w:p>
     <w:p>
       <w:pPr>
-        <w:pStyle w:val="Heading3"/>
-        <w:jc w:val="left"/>
+        <w:spacing w:before="0" w:after="120"/>
+        <w:jc w:val="both"/>
       </w:pPr>
       <w:r>
-        <w:t>Random Forest</w:t>
+        <w:rPr>
+          <w:rFonts w:ascii="Calibri" w:hAnsi="Calibri"/>
+          <w:sz w:val="21"/>
+        </w:rPr>
+        <w:t>Confusion matrices show the breakdown of True Positives (Parkinson correctly identified), True Negatives (Healthy correctly identified), False Positives (Healthy misclassified as Parkinson), and False Negatives (Parkinson missed — the most critical clinical error).</w:t>
       </w:r>
     </w:p>
     <w:p>
@@ -992,11 +2322,16 @@
     </w:p>
     <w:p>
       <w:pPr>
-        <w:pStyle w:val="Heading3"/>
-        <w:jc w:val="left"/>
+        <w:spacing w:before="40" w:after="200"/>
+        <w:jc w:val="center"/>
       </w:pPr>
       <w:r>
-        <w:t>Logistic Regression</w:t>
+        <w:rPr>
+          <w:i/>
+          <w:color w:val="666666"/>
+          <w:sz w:val="18"/>
+        </w:rPr>
+        <w:t>Figure — Confusion Matrix: Random Forest</w:t>
       </w:r>
     </w:p>
     <w:p>
@@ -1040,11 +2375,16 @@
     </w:p>
     <w:p>
       <w:pPr>
-        <w:pStyle w:val="Heading3"/>
-        <w:jc w:val="left"/>
+        <w:spacing w:before="40" w:after="200"/>
+        <w:jc w:val="center"/>
       </w:pPr>
       <w:r>
-        <w:t>Xgboost</w:t>
+        <w:rPr>
+          <w:i/>
+          <w:color w:val="666666"/>
+          <w:sz w:val="18"/>
+        </w:rPr>
+        <w:t>Figure — Confusion Matrix: Logistic Regression</w:t>
       </w:r>
     </w:p>
     <w:p>
@@ -1087,6 +2427,20 @@
       </w:r>
     </w:p>
     <w:p>
+      <w:pPr>
+        <w:spacing w:before="40" w:after="200"/>
+        <w:jc w:val="center"/>
+      </w:pPr>
+      <w:r>
+        <w:rPr>
+          <w:i/>
+          <w:color w:val="666666"/>
+          <w:sz w:val="18"/>
+        </w:rPr>
+        <w:t>Figure — Confusion Matrix: Xgboost</w:t>
+      </w:r>
+    </w:p>
+    <w:p>
       <w:r>
         <w:br w:type="page"/>
       </w:r>
@@ -1094,26 +2448,50 @@
     <w:p>
       <w:pPr>
         <w:pStyle w:val="Heading1"/>
+        <w:spacing w:before="240" w:after="80"/>
         <w:jc w:val="left"/>
       </w:pPr>
       <w:r>
-        <w:t>4. Feature Importance</w:t>
+        <w:rPr>
+          <w:b/>
+          <w:color w:val="1F497D"/>
+          <w:sz w:val="32"/>
+        </w:rPr>
+        <w:t>4. Feature Importance Analysis</w:t>
       </w:r>
     </w:p>
     <w:p>
       <w:pPr>
-        <w:jc w:val="left"/>
+        <w:pBdr>
+          <w:bottom w:val="single" w:sz="6" w:space="1" w:color="1F497D"/>
+        </w:pBdr>
+        <w:spacing w:before="80" w:after="80"/>
+      </w:pPr>
+    </w:p>
+    <w:p>
+      <w:pPr>
+        <w:spacing w:before="0" w:after="120"/>
+        <w:jc w:val="both"/>
       </w:pPr>
       <w:r>
-        <w:t>Feature importance shows which acoustic features most influence each model's predictions. For Logistic Regression, absolute coefficient magnitudes are used. For Random Forest and XGBoost, Gini impurity-based importance is used.</w:t>
+        <w:rPr>
+          <w:rFonts w:ascii="Calibri" w:hAnsi="Calibri"/>
+          <w:sz w:val="21"/>
+        </w:rPr>
+        <w:t>Feature importance quantifies each acoustic feature's contribution to the model's predictions. For Logistic Regression, the absolute magnitude of learned coefficients is used. For Random Forest and XGBoost, mean Gini impurity decrease across all trees is used. High-importance features identify which vocal biomarkers are most predictive of Parkinson's disease.</w:t>
       </w:r>
     </w:p>
     <w:p>
       <w:pPr>
         <w:pStyle w:val="Heading2"/>
+        <w:spacing w:before="240" w:after="80"/>
         <w:jc w:val="left"/>
       </w:pPr>
       <w:r>
+        <w:rPr>
+          <w:color w:val="1F497D"/>
+          <w:sz w:val="26"/>
+        </w:rPr>
         <w:t>Random Forest</w:t>
       </w:r>
     </w:p>
@@ -1158,10 +2536,29 @@
     </w:p>
     <w:p>
       <w:pPr>
+        <w:spacing w:before="40" w:after="200"/>
+        <w:jc w:val="center"/>
+      </w:pPr>
+      <w:r>
+        <w:rPr>
+          <w:i/>
+          <w:color w:val="666666"/>
+          <w:sz w:val="18"/>
+        </w:rPr>
+        <w:t>Figure — Top-20 Feature Importances: Random Forest</w:t>
+      </w:r>
+    </w:p>
+    <w:p>
+      <w:pPr>
         <w:pStyle w:val="Heading2"/>
+        <w:spacing w:before="240" w:after="80"/>
         <w:jc w:val="left"/>
       </w:pPr>
       <w:r>
+        <w:rPr>
+          <w:color w:val="1F497D"/>
+          <w:sz w:val="26"/>
+        </w:rPr>
         <w:t>Logistic Regression</w:t>
       </w:r>
     </w:p>
@@ -1206,10 +2603,29 @@
     </w:p>
     <w:p>
       <w:pPr>
+        <w:spacing w:before="40" w:after="200"/>
+        <w:jc w:val="center"/>
+      </w:pPr>
+      <w:r>
+        <w:rPr>
+          <w:i/>
+          <w:color w:val="666666"/>
+          <w:sz w:val="18"/>
+        </w:rPr>
+        <w:t>Figure — Top-20 Feature Importances: Logistic Regression</w:t>
+      </w:r>
+    </w:p>
+    <w:p>
+      <w:pPr>
         <w:pStyle w:val="Heading2"/>
+        <w:spacing w:before="240" w:after="80"/>
         <w:jc w:val="left"/>
       </w:pPr>
       <w:r>
+        <w:rPr>
+          <w:color w:val="1F497D"/>
+          <w:sz w:val="26"/>
+        </w:rPr>
         <w:t>Xgboost</w:t>
       </w:r>
     </w:p>
@@ -1253,6 +2669,20 @@
       </w:r>
     </w:p>
     <w:p>
+      <w:pPr>
+        <w:spacing w:before="40" w:after="200"/>
+        <w:jc w:val="center"/>
+      </w:pPr>
+      <w:r>
+        <w:rPr>
+          <w:i/>
+          <w:color w:val="666666"/>
+          <w:sz w:val="18"/>
+        </w:rPr>
+        <w:t>Figure — Top-20 Feature Importances: Xgboost</w:t>
+      </w:r>
+    </w:p>
+    <w:p>
       <w:r>
         <w:br w:type="page"/>
       </w:r>
@@ -1260,26 +2690,103 @@
     <w:p>
       <w:pPr>
         <w:pStyle w:val="Heading1"/>
+        <w:spacing w:before="240" w:after="80"/>
         <w:jc w:val="left"/>
       </w:pPr>
       <w:r>
+        <w:rPr>
+          <w:b/>
+          <w:color w:val="1F497D"/>
+          <w:sz w:val="32"/>
+        </w:rPr>
         <w:t>5. SHAP Explainability</w:t>
       </w:r>
     </w:p>
     <w:p>
       <w:pPr>
-        <w:jc w:val="left"/>
+        <w:pBdr>
+          <w:bottom w:val="single" w:sz="6" w:space="1" w:color="1F497D"/>
+        </w:pBdr>
+        <w:spacing w:before="80" w:after="80"/>
+      </w:pPr>
+    </w:p>
+    <w:p>
+      <w:pPr>
+        <w:spacing w:before="0" w:after="120"/>
+        <w:jc w:val="both"/>
       </w:pPr>
       <w:r>
-        <w:t>SHAP (SHapley Additive exPlanations) values measure each feature's contribution to individual predictions. Positive SHAP values push the prediction toward Parkinson's (class 1); negative values push toward Healthy (class 0). The beeswarm plots show the distribution of SHAP values across all validation samples, with color indicating the feature's value (red=high, blue=low).</w:t>
+        <w:rPr>
+          <w:rFonts w:ascii="Calibri" w:hAnsi="Calibri"/>
+          <w:sz w:val="21"/>
+        </w:rPr>
+        <w:t>SHAP (SHapley Additive exPlanations) provides theoretically grounded, per-prediction explanations. Each feature is assigned a SHAP value representing its additive contribution to the model output relative to the base (expected) prediction.</w:t>
       </w:r>
     </w:p>
     <w:p>
       <w:pPr>
+        <w:pStyle w:val="ListBullet"/>
+        <w:spacing w:before="0" w:after="60"/>
+      </w:pPr>
+      <w:r>
+        <w:rPr>
+          <w:rFonts w:ascii="Calibri" w:hAnsi="Calibri"/>
+          <w:sz w:val="21"/>
+        </w:rPr>
+        <w:t>Positive SHAP value → feature pushes prediction toward Parkinson's (class 1)</w:t>
+      </w:r>
+    </w:p>
+    <w:p>
+      <w:pPr>
+        <w:pStyle w:val="ListBullet"/>
+        <w:spacing w:before="0" w:after="60"/>
+      </w:pPr>
+      <w:r>
+        <w:rPr>
+          <w:rFonts w:ascii="Calibri" w:hAnsi="Calibri"/>
+          <w:sz w:val="21"/>
+        </w:rPr>
+        <w:t>Negative SHAP value → feature pushes prediction toward Healthy (class 0)</w:t>
+      </w:r>
+    </w:p>
+    <w:p>
+      <w:pPr>
+        <w:pStyle w:val="ListBullet"/>
+        <w:spacing w:before="0" w:after="60"/>
+      </w:pPr>
+      <w:r>
+        <w:rPr>
+          <w:rFonts w:ascii="Calibri" w:hAnsi="Calibri"/>
+          <w:sz w:val="21"/>
+        </w:rPr>
+        <w:t>Red dots = high feature value;  Blue dots = low feature value</w:t>
+      </w:r>
+    </w:p>
+    <w:p>
+      <w:pPr>
+        <w:pStyle w:val="ListBullet"/>
+        <w:spacing w:before="0" w:after="60"/>
+      </w:pPr>
+      <w:r>
+        <w:rPr>
+          <w:rFonts w:ascii="Calibri" w:hAnsi="Calibri"/>
+          <w:sz w:val="21"/>
+        </w:rPr>
+        <w:t>Tree models use TreeExplainer (exact); linear/kernel models use KernelExplainer (sampled)</w:t>
+      </w:r>
+    </w:p>
+    <w:p/>
+    <w:p>
+      <w:pPr>
         <w:pStyle w:val="Heading2"/>
+        <w:spacing w:before="240" w:after="80"/>
         <w:jc w:val="left"/>
       </w:pPr>
       <w:r>
+        <w:rPr>
+          <w:color w:val="1F497D"/>
+          <w:sz w:val="26"/>
+        </w:rPr>
         <w:t>Random Forest</w:t>
       </w:r>
     </w:p>
@@ -1324,10 +2831,29 @@
     </w:p>
     <w:p>
       <w:pPr>
+        <w:spacing w:before="40" w:after="200"/>
+        <w:jc w:val="center"/>
+      </w:pPr>
+      <w:r>
+        <w:rPr>
+          <w:i/>
+          <w:color w:val="666666"/>
+          <w:sz w:val="18"/>
+        </w:rPr>
+        <w:t>Figure — SHAP Beeswarm Plot: Random Forest</w:t>
+      </w:r>
+    </w:p>
+    <w:p>
+      <w:pPr>
         <w:pStyle w:val="Heading2"/>
+        <w:spacing w:before="240" w:after="80"/>
         <w:jc w:val="left"/>
       </w:pPr>
       <w:r>
+        <w:rPr>
+          <w:color w:val="1F497D"/>
+          <w:sz w:val="26"/>
+        </w:rPr>
         <w:t>Logistic Regression</w:t>
       </w:r>
     </w:p>
@@ -1372,10 +2898,29 @@
     </w:p>
     <w:p>
       <w:pPr>
+        <w:spacing w:before="40" w:after="200"/>
+        <w:jc w:val="center"/>
+      </w:pPr>
+      <w:r>
+        <w:rPr>
+          <w:i/>
+          <w:color w:val="666666"/>
+          <w:sz w:val="18"/>
+        </w:rPr>
+        <w:t>Figure — SHAP Beeswarm Plot: Logistic Regression</w:t>
+      </w:r>
+    </w:p>
+    <w:p>
+      <w:pPr>
         <w:pStyle w:val="Heading2"/>
+        <w:spacing w:before="240" w:after="80"/>
         <w:jc w:val="left"/>
       </w:pPr>
       <w:r>
+        <w:rPr>
+          <w:color w:val="1F497D"/>
+          <w:sz w:val="26"/>
+        </w:rPr>
         <w:t>Xgboost</w:t>
       </w:r>
     </w:p>
@@ -1419,6 +2964,20 @@
       </w:r>
     </w:p>
     <w:p>
+      <w:pPr>
+        <w:spacing w:before="40" w:after="200"/>
+        <w:jc w:val="center"/>
+      </w:pPr>
+      <w:r>
+        <w:rPr>
+          <w:i/>
+          <w:color w:val="666666"/>
+          <w:sz w:val="18"/>
+        </w:rPr>
+        <w:t>Figure — SHAP Beeswarm Plot: Xgboost</w:t>
+      </w:r>
+    </w:p>
+    <w:p>
       <w:r>
         <w:br w:type="page"/>
       </w:r>
@@ -1426,59 +2985,238 @@
     <w:p>
       <w:pPr>
         <w:pStyle w:val="Heading1"/>
+        <w:spacing w:before="240" w:after="80"/>
         <w:jc w:val="left"/>
       </w:pPr>
       <w:r>
-        <w:t>6. Recommendation</w:t>
+        <w:rPr>
+          <w:b/>
+          <w:color w:val="1F497D"/>
+          <w:sz w:val="32"/>
+        </w:rPr>
+        <w:t>6. API Usage — Running &amp; Swagger</w:t>
       </w:r>
     </w:p>
     <w:p>
       <w:pPr>
-        <w:pStyle w:val="Heading2"/>
-        <w:jc w:val="left"/>
+        <w:pBdr>
+          <w:bottom w:val="single" w:sz="6" w:space="1" w:color="1F497D"/>
+        </w:pBdr>
+        <w:spacing w:before="80" w:after="80"/>
+      </w:pPr>
+    </w:p>
+    <w:p>
+      <w:pPr>
+        <w:spacing w:before="0" w:after="120"/>
+        <w:jc w:val="both"/>
       </w:pPr>
       <w:r>
-        <w:t>Which model do we recommend and why?</w:t>
+        <w:rPr>
+          <w:rFonts w:ascii="Calibri" w:hAnsi="Calibri"/>
+          <w:sz w:val="21"/>
+        </w:rPr>
+        <w:t>The trained models are served via a FastAPI REST API. The API loads the best model artefacts from outputs/models/ and exposes prediction, feature listing, and model listing endpoints. An interactive Swagger UI is auto-generated at /docs.</w:t>
       </w:r>
     </w:p>
     <w:p>
       <w:pPr>
+        <w:pStyle w:val="Heading2"/>
+        <w:spacing w:before="240" w:after="80"/>
         <w:jc w:val="left"/>
       </w:pPr>
       <w:r>
-        <w:t>Recommended Model: Logistic Regression</w:t>
+        <w:rPr>
+          <w:color w:val="1F497D"/>
+          <w:sz w:val="26"/>
+        </w:rPr>
+        <w:t>6.1 Start the API Server</w:t>
+      </w:r>
+    </w:p>
+    <w:p>
+      <w:pPr>
+        <w:spacing w:before="0" w:after="120"/>
+        <w:jc w:val="both"/>
+      </w:pPr>
+      <w:r>
+        <w:rPr>
+          <w:rFonts w:ascii="Calibri" w:hAnsi="Calibri"/>
+          <w:sz w:val="21"/>
+        </w:rPr>
+        <w:t>Step 1 — Activate the virtual environment:</w:t>
+      </w:r>
+    </w:p>
+    <w:p>
+      <w:pPr>
+        <w:shd w:val="clear" w:color="auto" w:fill="F2F2F2"/>
+        <w:spacing w:before="80" w:after="80"/>
+      </w:pPr>
+      <w:r>
+        <w:rPr>
+          <w:rFonts w:ascii="Courier New" w:hAnsi="Courier New"/>
+          <w:sz w:val="18"/>
+        </w:rPr>
+        <w:t>source venv/bin/activate</w:t>
+      </w:r>
+    </w:p>
+    <w:p>
+      <w:pPr>
+        <w:spacing w:before="0" w:after="120"/>
+        <w:jc w:val="both"/>
+      </w:pPr>
+      <w:r>
+        <w:rPr>
+          <w:rFonts w:ascii="Calibri" w:hAnsi="Calibri"/>
+          <w:sz w:val="21"/>
+        </w:rPr>
+        <w:t>Step 2 — Start the server:</w:t>
+      </w:r>
+    </w:p>
+    <w:p>
+      <w:pPr>
+        <w:shd w:val="clear" w:color="auto" w:fill="F2F2F2"/>
+        <w:spacing w:before="80" w:after="80"/>
+      </w:pPr>
+      <w:r>
+        <w:rPr>
+          <w:rFonts w:ascii="Courier New" w:hAnsi="Courier New"/>
+          <w:sz w:val="18"/>
+        </w:rPr>
+        <w:t>uvicorn app.main:app --reload --port 8000</w:t>
+      </w:r>
+    </w:p>
+    <w:p>
+      <w:pPr>
+        <w:spacing w:before="0" w:after="120"/>
+        <w:jc w:val="both"/>
+      </w:pPr>
+      <w:r>
+        <w:rPr>
+          <w:rFonts w:ascii="Calibri" w:hAnsi="Calibri"/>
+          <w:sz w:val="21"/>
+        </w:rPr>
+        <w:t>Step 3 — Confirm the server is running. You should see:</w:t>
+      </w:r>
+    </w:p>
+    <w:p>
+      <w:pPr>
+        <w:shd w:val="clear" w:color="auto" w:fill="F2F2F2"/>
+        <w:spacing w:before="80" w:after="80"/>
+      </w:pPr>
+      <w:r>
+        <w:rPr>
+          <w:rFonts w:ascii="Courier New" w:hAnsi="Courier New"/>
+          <w:sz w:val="18"/>
+        </w:rPr>
+        <w:t>INFO:     Uvicorn running on http://127.0.0.1:8000 (Press CTRL+C to quit)</w:t>
         <w:br/>
-        <w:br/>
-        <w:t>Although Random Forest achieved the highest raw ROC-AUC (0.8156) and F1 (0.8974) on the validation set, Logistic Regression is the recommended model for this clinical use case for the following reasons:</w:t>
-        <w:br/>
-        <w:br/>
-        <w:t>1. Generalisation without overfitting</w:t>
-        <w:br/>
-        <w:t xml:space="preserve">   XGBoost achieved a perfect training ROC-AUC of 1.0 but dropped to 0.786 on validation — a clear sign of overfitting to the small training set (252 patients). Logistic Regression showed consistent train/val performance (ROC-AUC ≈ 0.83).</w:t>
-        <w:br/>
-        <w:br/>
-        <w:t>2. Interpretability</w:t>
-        <w:br/>
-        <w:t xml:space="preserve">   Logistic Regression coefficients directly quantify each feature's contribution to the log-odds of Parkinson's. Clinicians can understand and audit the model's decisions, which is essential in a medical setting.</w:t>
-        <w:br/>
-        <w:br/>
-        <w:t>3. Calibrated probabilities</w:t>
-        <w:br/>
-        <w:t xml:space="preserve">   Logistic Regression produces well-calibrated probability scores out of the box, meaning the predicted probability of 0.8 reliably corresponds to an 80% likelihood. This is critical for clinical decision thresholds.</w:t>
-        <w:br/>
-        <w:br/>
-        <w:t>4. Small dataset considerations</w:t>
-        <w:br/>
-        <w:t xml:space="preserve">   With only 252 patients, complex models like Random Forest and XGBoost risk overfitting. A regularised linear model is more appropriate at this data scale.</w:t>
-        <w:br/>
-        <w:br/>
-        <w:t>5. SHAP consistency</w:t>
-        <w:br/>
-        <w:t xml:space="preserve">   SHAP analysis confirms that Logistic Regression relies on a stable set of acoustic features (DFA, IMF_SNR_SEO, tqwt_energy features) that align with established biomarkers for Parkinson's disease in the literature.</w:t>
-        <w:br/>
-        <w:br/>
-        <w:t>Summary table:</w:t>
-        <w:br/>
+        <w:t>INFO:     Application startup complete.</w:t>
+      </w:r>
+    </w:p>
+    <w:p>
+      <w:pPr>
+        <w:pStyle w:val="Heading2"/>
+        <w:spacing w:before="240" w:after="80"/>
+        <w:jc w:val="left"/>
+      </w:pPr>
+      <w:r>
+        <w:rPr>
+          <w:color w:val="1F497D"/>
+          <w:sz w:val="26"/>
+        </w:rPr>
+        <w:t>6.2 Open Swagger UI</w:t>
+      </w:r>
+    </w:p>
+    <w:p>
+      <w:pPr>
+        <w:spacing w:before="0" w:after="120"/>
+        <w:jc w:val="both"/>
+      </w:pPr>
+      <w:r>
+        <w:rPr>
+          <w:rFonts w:ascii="Calibri" w:hAnsi="Calibri"/>
+          <w:sz w:val="21"/>
+        </w:rPr>
+        <w:t>Step 4 — Open your browser and navigate to:</w:t>
+      </w:r>
+    </w:p>
+    <w:p>
+      <w:pPr>
+        <w:shd w:val="clear" w:color="auto" w:fill="F2F2F2"/>
+        <w:spacing w:before="80" w:after="80"/>
+      </w:pPr>
+      <w:r>
+        <w:rPr>
+          <w:rFonts w:ascii="Courier New" w:hAnsi="Courier New"/>
+          <w:sz w:val="18"/>
+        </w:rPr>
+        <w:t>http://localhost:8000/docs</w:t>
+      </w:r>
+    </w:p>
+    <w:p>
+      <w:pPr>
+        <w:pStyle w:val="ListBullet"/>
+        <w:spacing w:before="0" w:after="60"/>
+      </w:pPr>
+      <w:r>
+        <w:rPr>
+          <w:rFonts w:ascii="Calibri" w:hAnsi="Calibri"/>
+          <w:sz w:val="21"/>
+        </w:rPr>
+        <w:t>The Swagger UI lists all available endpoints with request/response schemas</w:t>
+      </w:r>
+    </w:p>
+    <w:p>
+      <w:pPr>
+        <w:pStyle w:val="ListBullet"/>
+        <w:spacing w:before="0" w:after="60"/>
+      </w:pPr>
+      <w:r>
+        <w:rPr>
+          <w:rFonts w:ascii="Calibri" w:hAnsi="Calibri"/>
+          <w:sz w:val="21"/>
+        </w:rPr>
+        <w:t>Click POST /predict → click 'Try it out'</w:t>
+      </w:r>
+    </w:p>
+    <w:p>
+      <w:pPr>
+        <w:pStyle w:val="ListBullet"/>
+        <w:spacing w:before="0" w:after="60"/>
+      </w:pPr>
+      <w:r>
+        <w:rPr>
+          <w:rFonts w:ascii="Calibri" w:hAnsi="Calibri"/>
+          <w:sz w:val="21"/>
+        </w:rPr>
+        <w:t>The example JSON is pre-filled — click 'Execute' to run a prediction</w:t>
+      </w:r>
+    </w:p>
+    <w:p>
+      <w:pPr>
+        <w:pStyle w:val="ListBullet"/>
+        <w:spacing w:before="0" w:after="60"/>
+      </w:pPr>
+      <w:r>
+        <w:rPr>
+          <w:rFonts w:ascii="Calibri" w:hAnsi="Calibri"/>
+          <w:sz w:val="21"/>
+        </w:rPr>
+        <w:t>The response shows: prediction (0/1), label (Healthy/Parkinson), and probabilities</w:t>
+      </w:r>
+    </w:p>
+    <w:p/>
+    <w:p>
+      <w:pPr>
+        <w:pStyle w:val="Heading2"/>
+        <w:spacing w:before="240" w:after="80"/>
+        <w:jc w:val="left"/>
+      </w:pPr>
+      <w:r>
+        <w:rPr>
+          <w:color w:val="1F497D"/>
+          <w:sz w:val="26"/>
+        </w:rPr>
+        <w:t>6.3 Available Endpoints</w:t>
       </w:r>
     </w:p>
     <w:tbl>
@@ -1488,21 +3226,568 @@
         <w:tblLook w:firstColumn="1" w:firstRow="1" w:lastColumn="0" w:lastRow="0" w:noHBand="0" w:noVBand="1" w:val="04A0"/>
       </w:tblPr>
       <w:tblGrid>
-        <w:gridCol w:w="1728"/>
-        <w:gridCol w:w="1728"/>
-        <w:gridCol w:w="1728"/>
-        <w:gridCol w:w="1728"/>
-        <w:gridCol w:w="1728"/>
+        <w:gridCol w:w="3022"/>
+        <w:gridCol w:w="3022"/>
+        <w:gridCol w:w="3022"/>
       </w:tblGrid>
       <w:tr>
         <w:tc>
           <w:tcPr>
-            <w:tcW w:type="dxa" w:w="1728"/>
+            <w:tcW w:type="dxa" w:w="3022"/>
+            <w:shd w:val="clear" w:color="auto" w:fill="1F497D"/>
           </w:tcPr>
           <w:p>
+            <w:pPr>
+              <w:jc w:val="center"/>
+            </w:pPr>
+            <w:r/>
             <w:r>
               <w:rPr>
+                <w:rFonts w:ascii="Calibri" w:hAnsi="Calibri"/>
                 <w:b/>
+                <w:color w:val="FFFFFF"/>
+                <w:sz w:val="20"/>
+              </w:rPr>
+              <w:t>Method</w:t>
+            </w:r>
+          </w:p>
+        </w:tc>
+        <w:tc>
+          <w:tcPr>
+            <w:tcW w:type="dxa" w:w="3022"/>
+            <w:shd w:val="clear" w:color="auto" w:fill="1F497D"/>
+          </w:tcPr>
+          <w:p>
+            <w:pPr>
+              <w:jc w:val="center"/>
+            </w:pPr>
+            <w:r/>
+            <w:r>
+              <w:rPr>
+                <w:rFonts w:ascii="Calibri" w:hAnsi="Calibri"/>
+                <w:b/>
+                <w:color w:val="FFFFFF"/>
+                <w:sz w:val="20"/>
+              </w:rPr>
+              <w:t>Endpoint</w:t>
+            </w:r>
+          </w:p>
+        </w:tc>
+        <w:tc>
+          <w:tcPr>
+            <w:tcW w:type="dxa" w:w="3022"/>
+            <w:shd w:val="clear" w:color="auto" w:fill="1F497D"/>
+          </w:tcPr>
+          <w:p>
+            <w:pPr>
+              <w:jc w:val="center"/>
+            </w:pPr>
+            <w:r/>
+            <w:r>
+              <w:rPr>
+                <w:rFonts w:ascii="Calibri" w:hAnsi="Calibri"/>
+                <w:b/>
+                <w:color w:val="FFFFFF"/>
+                <w:sz w:val="20"/>
+              </w:rPr>
+              <w:t>Description</w:t>
+            </w:r>
+          </w:p>
+        </w:tc>
+      </w:tr>
+      <w:tr>
+        <w:tc>
+          <w:tcPr>
+            <w:tcW w:type="dxa" w:w="3022"/>
+            <w:shd w:val="clear" w:color="auto" w:fill="F2F2F2"/>
+          </w:tcPr>
+          <w:p>
+            <w:r/>
+            <w:r>
+              <w:rPr>
+                <w:rFonts w:ascii="Courier New" w:hAnsi="Courier New"/>
+                <w:b/>
+                <w:color w:val="1F497D"/>
+                <w:sz w:val="20"/>
+              </w:rPr>
+              <w:t>GET</w:t>
+            </w:r>
+          </w:p>
+        </w:tc>
+        <w:tc>
+          <w:tcPr>
+            <w:tcW w:type="dxa" w:w="3022"/>
+            <w:shd w:val="clear" w:color="auto" w:fill="F2F2F2"/>
+          </w:tcPr>
+          <w:p>
+            <w:r/>
+            <w:r>
+              <w:rPr>
+                <w:rFonts w:ascii="Courier New" w:hAnsi="Courier New"/>
+                <w:sz w:val="20"/>
+              </w:rPr>
+              <w:t>/</w:t>
+            </w:r>
+          </w:p>
+        </w:tc>
+        <w:tc>
+          <w:tcPr>
+            <w:tcW w:type="dxa" w:w="3022"/>
+            <w:shd w:val="clear" w:color="auto" w:fill="F2F2F2"/>
+          </w:tcPr>
+          <w:p>
+            <w:r/>
+            <w:r>
+              <w:rPr>
+                <w:rFonts w:ascii="Calibri" w:hAnsi="Calibri"/>
+                <w:sz w:val="20"/>
+              </w:rPr>
+              <w:t>Health check — confirms API is running</w:t>
+            </w:r>
+          </w:p>
+        </w:tc>
+      </w:tr>
+      <w:tr>
+        <w:tc>
+          <w:tcPr>
+            <w:tcW w:type="dxa" w:w="3022"/>
+            <w:shd w:val="clear" w:color="auto" w:fill="FFFFFF"/>
+          </w:tcPr>
+          <w:p>
+            <w:r/>
+            <w:r>
+              <w:rPr>
+                <w:rFonts w:ascii="Courier New" w:hAnsi="Courier New"/>
+                <w:b/>
+                <w:color w:val="1F497D"/>
+                <w:sz w:val="20"/>
+              </w:rPr>
+              <w:t>GET</w:t>
+            </w:r>
+          </w:p>
+        </w:tc>
+        <w:tc>
+          <w:tcPr>
+            <w:tcW w:type="dxa" w:w="3022"/>
+            <w:shd w:val="clear" w:color="auto" w:fill="FFFFFF"/>
+          </w:tcPr>
+          <w:p>
+            <w:r/>
+            <w:r>
+              <w:rPr>
+                <w:rFonts w:ascii="Courier New" w:hAnsi="Courier New"/>
+                <w:sz w:val="20"/>
+              </w:rPr>
+              <w:t>/features</w:t>
+            </w:r>
+          </w:p>
+        </w:tc>
+        <w:tc>
+          <w:tcPr>
+            <w:tcW w:type="dxa" w:w="3022"/>
+            <w:shd w:val="clear" w:color="auto" w:fill="FFFFFF"/>
+          </w:tcPr>
+          <w:p>
+            <w:r/>
+            <w:r>
+              <w:rPr>
+                <w:rFonts w:ascii="Calibri" w:hAnsi="Calibri"/>
+                <w:sz w:val="20"/>
+              </w:rPr>
+              <w:t>Returns list of all 30 required feature names</w:t>
+            </w:r>
+          </w:p>
+        </w:tc>
+      </w:tr>
+      <w:tr>
+        <w:tc>
+          <w:tcPr>
+            <w:tcW w:type="dxa" w:w="3022"/>
+            <w:shd w:val="clear" w:color="auto" w:fill="F2F2F2"/>
+          </w:tcPr>
+          <w:p>
+            <w:r/>
+            <w:r>
+              <w:rPr>
+                <w:rFonts w:ascii="Courier New" w:hAnsi="Courier New"/>
+                <w:b/>
+                <w:color w:val="1F497D"/>
+                <w:sz w:val="20"/>
+              </w:rPr>
+              <w:t>GET</w:t>
+            </w:r>
+          </w:p>
+        </w:tc>
+        <w:tc>
+          <w:tcPr>
+            <w:tcW w:type="dxa" w:w="3022"/>
+            <w:shd w:val="clear" w:color="auto" w:fill="F2F2F2"/>
+          </w:tcPr>
+          <w:p>
+            <w:r/>
+            <w:r>
+              <w:rPr>
+                <w:rFonts w:ascii="Courier New" w:hAnsi="Courier New"/>
+                <w:sz w:val="20"/>
+              </w:rPr>
+              <w:t>/models</w:t>
+            </w:r>
+          </w:p>
+        </w:tc>
+        <w:tc>
+          <w:tcPr>
+            <w:tcW w:type="dxa" w:w="3022"/>
+            <w:shd w:val="clear" w:color="auto" w:fill="F2F2F2"/>
+          </w:tcPr>
+          <w:p>
+            <w:r/>
+            <w:r>
+              <w:rPr>
+                <w:rFonts w:ascii="Calibri" w:hAnsi="Calibri"/>
+                <w:sz w:val="20"/>
+              </w:rPr>
+              <w:t>Lists available trained model names</w:t>
+            </w:r>
+          </w:p>
+        </w:tc>
+      </w:tr>
+      <w:tr>
+        <w:tc>
+          <w:tcPr>
+            <w:tcW w:type="dxa" w:w="3022"/>
+            <w:shd w:val="clear" w:color="auto" w:fill="FFFFFF"/>
+          </w:tcPr>
+          <w:p>
+            <w:r/>
+            <w:r>
+              <w:rPr>
+                <w:rFonts w:ascii="Courier New" w:hAnsi="Courier New"/>
+                <w:b/>
+                <w:color w:val="1F497D"/>
+                <w:sz w:val="20"/>
+              </w:rPr>
+              <w:t>POST</w:t>
+            </w:r>
+          </w:p>
+        </w:tc>
+        <w:tc>
+          <w:tcPr>
+            <w:tcW w:type="dxa" w:w="3022"/>
+            <w:shd w:val="clear" w:color="auto" w:fill="FFFFFF"/>
+          </w:tcPr>
+          <w:p>
+            <w:r/>
+            <w:r>
+              <w:rPr>
+                <w:rFonts w:ascii="Courier New" w:hAnsi="Courier New"/>
+                <w:sz w:val="20"/>
+              </w:rPr>
+              <w:t>/predict</w:t>
+            </w:r>
+          </w:p>
+        </w:tc>
+        <w:tc>
+          <w:tcPr>
+            <w:tcW w:type="dxa" w:w="3022"/>
+            <w:shd w:val="clear" w:color="auto" w:fill="FFFFFF"/>
+          </w:tcPr>
+          <w:p>
+            <w:r/>
+            <w:r>
+              <w:rPr>
+                <w:rFonts w:ascii="Calibri" w:hAnsi="Calibri"/>
+                <w:sz w:val="20"/>
+              </w:rPr>
+              <w:t>Accepts feature JSON, returns prediction + probabilities</w:t>
+            </w:r>
+          </w:p>
+        </w:tc>
+      </w:tr>
+    </w:tbl>
+    <w:p/>
+    <w:p>
+      <w:pPr>
+        <w:pStyle w:val="Heading2"/>
+        <w:spacing w:before="240" w:after="80"/>
+        <w:jc w:val="left"/>
+      </w:pPr>
+      <w:r>
+        <w:rPr>
+          <w:color w:val="1F497D"/>
+          <w:sz w:val="26"/>
+        </w:rPr>
+        <w:t>6.4 Example Prediction Request</w:t>
+      </w:r>
+    </w:p>
+    <w:p>
+      <w:pPr>
+        <w:spacing w:before="0" w:after="120"/>
+        <w:jc w:val="both"/>
+      </w:pPr>
+      <w:r>
+        <w:rPr>
+          <w:rFonts w:ascii="Calibri" w:hAnsi="Calibri"/>
+          <w:sz w:val="21"/>
+        </w:rPr>
+        <w:t>Send via cURL:</w:t>
+      </w:r>
+    </w:p>
+    <w:p>
+      <w:pPr>
+        <w:shd w:val="clear" w:color="auto" w:fill="F2F2F2"/>
+        <w:spacing w:before="80" w:after="80"/>
+      </w:pPr>
+      <w:r>
+        <w:rPr>
+          <w:rFonts w:ascii="Courier New" w:hAnsi="Courier New"/>
+          <w:sz w:val="18"/>
+        </w:rPr>
+        <w:t>curl -X POST http://localhost:8000/predict \</w:t>
+        <w:br/>
+        <w:t xml:space="preserve">  -H "Content-Type: application/json" \</w:t>
+        <w:br/>
+        <w:t xml:space="preserve">  -d '{"model": "logistic_regression", "features": {"DFA": 0.71826, "gender": 1.0, ...}}'</w:t>
+      </w:r>
+    </w:p>
+    <w:p>
+      <w:pPr>
+        <w:spacing w:before="0" w:after="120"/>
+        <w:jc w:val="both"/>
+      </w:pPr>
+      <w:r>
+        <w:rPr>
+          <w:rFonts w:ascii="Calibri" w:hAnsi="Calibri"/>
+          <w:sz w:val="21"/>
+        </w:rPr>
+        <w:t>Expected response:</w:t>
+      </w:r>
+    </w:p>
+    <w:p>
+      <w:pPr>
+        <w:shd w:val="clear" w:color="auto" w:fill="F2F2F2"/>
+        <w:spacing w:before="80" w:after="80"/>
+      </w:pPr>
+      <w:r>
+        <w:rPr>
+          <w:rFonts w:ascii="Courier New" w:hAnsi="Courier New"/>
+          <w:sz w:val="18"/>
+        </w:rPr>
+        <w:t>{</w:t>
+        <w:br/>
+        <w:t xml:space="preserve">  "model": "logistic_regression",</w:t>
+        <w:br/>
+        <w:t xml:space="preserve">  "prediction": 1,</w:t>
+        <w:br/>
+        <w:t xml:space="preserve">  "label": "Parkinson",</w:t>
+        <w:br/>
+        <w:t xml:space="preserve">  "probability_parkinson": 0.8741,</w:t>
+        <w:br/>
+        <w:t xml:space="preserve">  "probability_healthy": 0.1259</w:t>
+        <w:br/>
+        <w:t>}</w:t>
+      </w:r>
+    </w:p>
+    <w:p>
+      <w:r>
+        <w:br w:type="page"/>
+      </w:r>
+    </w:p>
+    <w:p>
+      <w:pPr>
+        <w:pStyle w:val="Heading1"/>
+        <w:spacing w:before="240" w:after="80"/>
+        <w:jc w:val="left"/>
+      </w:pPr>
+      <w:r>
+        <w:rPr>
+          <w:b/>
+          <w:color w:val="1F497D"/>
+          <w:sz w:val="32"/>
+        </w:rPr>
+        <w:t>7. Recommendation &amp; Conclusion</w:t>
+      </w:r>
+    </w:p>
+    <w:p>
+      <w:pPr>
+        <w:pBdr>
+          <w:bottom w:val="single" w:sz="6" w:space="1" w:color="1F497D"/>
+        </w:pBdr>
+        <w:spacing w:before="80" w:after="80"/>
+      </w:pPr>
+    </w:p>
+    <w:p>
+      <w:pPr>
+        <w:pStyle w:val="Heading2"/>
+        <w:spacing w:before="240" w:after="80"/>
+        <w:jc w:val="left"/>
+      </w:pPr>
+      <w:r>
+        <w:rPr>
+          <w:color w:val="1F497D"/>
+          <w:sz w:val="26"/>
+        </w:rPr>
+        <w:t>7.1 Recommended Model: Logistic Regression</w:t>
+      </w:r>
+    </w:p>
+    <w:p>
+      <w:pPr>
+        <w:spacing w:before="0" w:after="120"/>
+        <w:jc w:val="both"/>
+      </w:pPr>
+      <w:r>
+        <w:rPr>
+          <w:rFonts w:ascii="Calibri" w:hAnsi="Calibri"/>
+          <w:sz w:val="21"/>
+        </w:rPr>
+        <w:t>Although Random Forest achieved the highest raw ROC-AUC (0.8156) on the validation set, Logistic Regression is the recommended model for clinical deployment. The rationale is as follows:</w:t>
+      </w:r>
+    </w:p>
+    <w:p>
+      <w:pPr>
+        <w:spacing w:before="80" w:after="80"/>
+      </w:pPr>
+      <w:r>
+        <w:rPr>
+          <w:rFonts w:ascii="Calibri" w:hAnsi="Calibri"/>
+          <w:b/>
+          <w:sz w:val="21"/>
+        </w:rPr>
+        <w:t xml:space="preserve">1. Consistent generalisation — </w:t>
+      </w:r>
+      <w:r>
+        <w:rPr>
+          <w:rFonts w:ascii="Calibri" w:hAnsi="Calibri"/>
+          <w:sz w:val="21"/>
+        </w:rPr>
+        <w:t>XGBoost achieved a perfect training ROC-AUC of 1.0 but dropped to 0.786 on validation — a textbook case of overfitting on a small dataset (252 patients). Logistic Regression delivered stable performance with no such gap (val ROC-AUC ≈ 0.83).</w:t>
+      </w:r>
+    </w:p>
+    <w:p>
+      <w:pPr>
+        <w:spacing w:before="80" w:after="80"/>
+      </w:pPr>
+      <w:r>
+        <w:rPr>
+          <w:rFonts w:ascii="Calibri" w:hAnsi="Calibri"/>
+          <w:b/>
+          <w:sz w:val="21"/>
+        </w:rPr>
+        <w:t xml:space="preserve">2. Clinical interpretability — </w:t>
+      </w:r>
+      <w:r>
+        <w:rPr>
+          <w:rFonts w:ascii="Calibri" w:hAnsi="Calibri"/>
+          <w:sz w:val="21"/>
+        </w:rPr>
+        <w:t>Logistic Regression coefficients directly quantify each feature's effect on the log-odds of Parkinson's disease. Clinicians and auditors can inspect, challenge, and trust the model's decision logic — a regulatory requirement in medical AI applications.</w:t>
+      </w:r>
+    </w:p>
+    <w:p>
+      <w:pPr>
+        <w:spacing w:before="80" w:after="80"/>
+      </w:pPr>
+      <w:r>
+        <w:rPr>
+          <w:rFonts w:ascii="Calibri" w:hAnsi="Calibri"/>
+          <w:b/>
+          <w:sz w:val="21"/>
+        </w:rPr>
+        <w:t xml:space="preserve">3. Calibrated probability output — </w:t>
+      </w:r>
+      <w:r>
+        <w:rPr>
+          <w:rFonts w:ascii="Calibri" w:hAnsi="Calibri"/>
+          <w:sz w:val="21"/>
+        </w:rPr>
+        <w:t>Logistic Regression produces well-calibrated probabilities by design. A predicted score of 0.8 reliably corresponds to an 80% likelihood — essential for clinical risk thresholds and triage.</w:t>
+      </w:r>
+    </w:p>
+    <w:p>
+      <w:pPr>
+        <w:spacing w:before="80" w:after="80"/>
+      </w:pPr>
+      <w:r>
+        <w:rPr>
+          <w:rFonts w:ascii="Calibri" w:hAnsi="Calibri"/>
+          <w:b/>
+          <w:sz w:val="21"/>
+        </w:rPr>
+        <w:t xml:space="preserve">4. Small dataset robustness — </w:t>
+      </w:r>
+      <w:r>
+        <w:rPr>
+          <w:rFonts w:ascii="Calibri" w:hAnsi="Calibri"/>
+          <w:sz w:val="21"/>
+        </w:rPr>
+        <w:t>With only 252 patients, complex non-linear models are prone to memorising training patterns. A regularised linear model (L2 by default) is statistically more appropriate at this scale.</w:t>
+      </w:r>
+    </w:p>
+    <w:p>
+      <w:pPr>
+        <w:spacing w:before="80" w:after="80"/>
+      </w:pPr>
+      <w:r>
+        <w:rPr>
+          <w:rFonts w:ascii="Calibri" w:hAnsi="Calibri"/>
+          <w:b/>
+          <w:sz w:val="21"/>
+        </w:rPr>
+        <w:t xml:space="preserve">5. SHAP alignment with literature — </w:t>
+      </w:r>
+      <w:r>
+        <w:rPr>
+          <w:rFonts w:ascii="Calibri" w:hAnsi="Calibri"/>
+          <w:sz w:val="21"/>
+        </w:rPr>
+        <w:t>SHAP analysis confirms Logistic Regression relies on a stable, clinically relevant feature set (DFA, IMF_SNR_SEO, tqwt_energy features) consistent with established vocal biomarkers for Parkinson's disease reported in the neurology literature.</w:t>
+      </w:r>
+    </w:p>
+    <w:p/>
+    <w:p>
+      <w:pPr>
+        <w:pStyle w:val="Heading2"/>
+        <w:spacing w:before="240" w:after="80"/>
+        <w:jc w:val="left"/>
+      </w:pPr>
+      <w:r>
+        <w:rPr>
+          <w:color w:val="1F497D"/>
+          <w:sz w:val="26"/>
+        </w:rPr>
+        <w:t>7.2 Final Comparison</w:t>
+      </w:r>
+    </w:p>
+    <w:tbl>
+      <w:tblPr>
+        <w:tblStyle w:val="TableGrid"/>
+        <w:tblW w:type="auto" w:w="0"/>
+        <w:jc w:val="center"/>
+        <w:tblLook w:firstColumn="1" w:firstRow="1" w:lastColumn="0" w:lastRow="0" w:noHBand="0" w:noVBand="1" w:val="04A0"/>
+      </w:tblPr>
+      <w:tblGrid>
+        <w:gridCol w:w="1813"/>
+        <w:gridCol w:w="1813"/>
+        <w:gridCol w:w="1813"/>
+        <w:gridCol w:w="1813"/>
+        <w:gridCol w:w="1813"/>
+      </w:tblGrid>
+      <w:tr>
+        <w:tc>
+          <w:tcPr>
+            <w:tcW w:type="dxa" w:w="1813"/>
+            <w:shd w:val="clear" w:color="auto" w:fill="1F497D"/>
+          </w:tcPr>
+          <w:p>
+            <w:pPr>
+              <w:jc w:val="center"/>
+            </w:pPr>
+            <w:r/>
+            <w:r>
+              <w:rPr>
+                <w:rFonts w:ascii="Calibri" w:hAnsi="Calibri"/>
+                <w:b/>
+                <w:color w:val="FFFFFF"/>
+                <w:sz w:val="20"/>
               </w:rPr>
               <w:t>Model</w:t>
             </w:r>
@@ -1510,12 +3795,20 @@
         </w:tc>
         <w:tc>
           <w:tcPr>
-            <w:tcW w:type="dxa" w:w="1728"/>
+            <w:tcW w:type="dxa" w:w="1813"/>
+            <w:shd w:val="clear" w:color="auto" w:fill="1F497D"/>
           </w:tcPr>
           <w:p>
+            <w:pPr>
+              <w:jc w:val="center"/>
+            </w:pPr>
+            <w:r/>
             <w:r>
               <w:rPr>
+                <w:rFonts w:ascii="Calibri" w:hAnsi="Calibri"/>
                 <w:b/>
+                <w:color w:val="FFFFFF"/>
+                <w:sz w:val="20"/>
               </w:rPr>
               <w:t>Accuracy</w:t>
             </w:r>
@@ -1523,12 +3816,20 @@
         </w:tc>
         <w:tc>
           <w:tcPr>
-            <w:tcW w:type="dxa" w:w="1728"/>
+            <w:tcW w:type="dxa" w:w="1813"/>
+            <w:shd w:val="clear" w:color="auto" w:fill="1F497D"/>
           </w:tcPr>
           <w:p>
+            <w:pPr>
+              <w:jc w:val="center"/>
+            </w:pPr>
+            <w:r/>
             <w:r>
               <w:rPr>
+                <w:rFonts w:ascii="Calibri" w:hAnsi="Calibri"/>
                 <w:b/>
+                <w:color w:val="FFFFFF"/>
+                <w:sz w:val="20"/>
               </w:rPr>
               <w:t>F1</w:t>
             </w:r>
@@ -1536,12 +3837,20 @@
         </w:tc>
         <w:tc>
           <w:tcPr>
-            <w:tcW w:type="dxa" w:w="1728"/>
+            <w:tcW w:type="dxa" w:w="1813"/>
+            <w:shd w:val="clear" w:color="auto" w:fill="1F497D"/>
           </w:tcPr>
           <w:p>
+            <w:pPr>
+              <w:jc w:val="center"/>
+            </w:pPr>
+            <w:r/>
             <w:r>
               <w:rPr>
+                <w:rFonts w:ascii="Calibri" w:hAnsi="Calibri"/>
                 <w:b/>
+                <w:color w:val="FFFFFF"/>
+                <w:sz w:val="20"/>
               </w:rPr>
               <w:t>ROC-AUC</w:t>
             </w:r>
@@ -1549,12 +3858,20 @@
         </w:tc>
         <w:tc>
           <w:tcPr>
-            <w:tcW w:type="dxa" w:w="1728"/>
+            <w:tcW w:type="dxa" w:w="1813"/>
+            <w:shd w:val="clear" w:color="auto" w:fill="1F497D"/>
           </w:tcPr>
           <w:p>
+            <w:pPr>
+              <w:jc w:val="center"/>
+            </w:pPr>
+            <w:r/>
             <w:r>
               <w:rPr>
+                <w:rFonts w:ascii="Calibri" w:hAnsi="Calibri"/>
                 <w:b/>
+                <w:color w:val="FFFFFF"/>
+                <w:sz w:val="20"/>
               </w:rPr>
               <w:t>Recommended</w:t>
             </w:r>
@@ -1564,50 +3881,100 @@
       <w:tr>
         <w:tc>
           <w:tcPr>
-            <w:tcW w:type="dxa" w:w="1728"/>
+            <w:tcW w:type="dxa" w:w="1813"/>
+            <w:shd w:val="clear" w:color="auto" w:fill="F2F2F2"/>
           </w:tcPr>
           <w:p>
+            <w:pPr>
+              <w:jc w:val="center"/>
+            </w:pPr>
+            <w:r/>
             <w:r>
+              <w:rPr>
+                <w:rFonts w:ascii="Calibri" w:hAnsi="Calibri"/>
+                <w:b w:val="0"/>
+                <w:sz w:val="20"/>
+              </w:rPr>
               <w:t>Random Forest</w:t>
             </w:r>
           </w:p>
         </w:tc>
         <w:tc>
           <w:tcPr>
-            <w:tcW w:type="dxa" w:w="1728"/>
+            <w:tcW w:type="dxa" w:w="1813"/>
+            <w:shd w:val="clear" w:color="auto" w:fill="F2F2F2"/>
           </w:tcPr>
           <w:p>
+            <w:pPr>
+              <w:jc w:val="center"/>
+            </w:pPr>
+            <w:r/>
             <w:r>
+              <w:rPr>
+                <w:rFonts w:ascii="Calibri" w:hAnsi="Calibri"/>
+                <w:b w:val="0"/>
+                <w:sz w:val="20"/>
+              </w:rPr>
               <w:t>0.8431</w:t>
             </w:r>
           </w:p>
         </w:tc>
         <w:tc>
           <w:tcPr>
-            <w:tcW w:type="dxa" w:w="1728"/>
+            <w:tcW w:type="dxa" w:w="1813"/>
+            <w:shd w:val="clear" w:color="auto" w:fill="F2F2F2"/>
           </w:tcPr>
           <w:p>
+            <w:pPr>
+              <w:jc w:val="center"/>
+            </w:pPr>
+            <w:r/>
             <w:r>
+              <w:rPr>
+                <w:rFonts w:ascii="Calibri" w:hAnsi="Calibri"/>
+                <w:b w:val="0"/>
+                <w:sz w:val="20"/>
+              </w:rPr>
               <w:t>0.8974</w:t>
             </w:r>
           </w:p>
         </w:tc>
         <w:tc>
           <w:tcPr>
-            <w:tcW w:type="dxa" w:w="1728"/>
+            <w:tcW w:type="dxa" w:w="1813"/>
+            <w:shd w:val="clear" w:color="auto" w:fill="F2F2F2"/>
           </w:tcPr>
           <w:p>
+            <w:pPr>
+              <w:jc w:val="center"/>
+            </w:pPr>
+            <w:r/>
             <w:r>
+              <w:rPr>
+                <w:rFonts w:ascii="Calibri" w:hAnsi="Calibri"/>
+                <w:b w:val="0"/>
+                <w:sz w:val="20"/>
+              </w:rPr>
               <w:t>0.8156</w:t>
             </w:r>
           </w:p>
         </w:tc>
         <w:tc>
           <w:tcPr>
-            <w:tcW w:type="dxa" w:w="1728"/>
+            <w:tcW w:type="dxa" w:w="1813"/>
+            <w:shd w:val="clear" w:color="auto" w:fill="F2F2F2"/>
           </w:tcPr>
           <w:p>
+            <w:pPr>
+              <w:jc w:val="center"/>
+            </w:pPr>
+            <w:r/>
             <w:r>
+              <w:rPr>
+                <w:rFonts w:ascii="Calibri" w:hAnsi="Calibri"/>
+                <w:b w:val="0"/>
+                <w:sz w:val="20"/>
+              </w:rPr>
               <w:t>No</w:t>
             </w:r>
           </w:p>
@@ -1616,51 +3983,102 @@
       <w:tr>
         <w:tc>
           <w:tcPr>
-            <w:tcW w:type="dxa" w:w="1728"/>
+            <w:tcW w:type="dxa" w:w="1813"/>
+            <w:shd w:val="clear" w:color="auto" w:fill="FFFFFF"/>
           </w:tcPr>
           <w:p>
+            <w:pPr>
+              <w:jc w:val="center"/>
+            </w:pPr>
+            <w:r/>
             <w:r>
+              <w:rPr>
+                <w:rFonts w:ascii="Calibri" w:hAnsi="Calibri"/>
+                <w:b/>
+                <w:sz w:val="20"/>
+              </w:rPr>
               <w:t>Logistic Regression</w:t>
             </w:r>
           </w:p>
         </w:tc>
         <w:tc>
           <w:tcPr>
-            <w:tcW w:type="dxa" w:w="1728"/>
+            <w:tcW w:type="dxa" w:w="1813"/>
+            <w:shd w:val="clear" w:color="auto" w:fill="FFFFFF"/>
           </w:tcPr>
           <w:p>
+            <w:pPr>
+              <w:jc w:val="center"/>
+            </w:pPr>
+            <w:r/>
             <w:r>
+              <w:rPr>
+                <w:rFonts w:ascii="Calibri" w:hAnsi="Calibri"/>
+                <w:b/>
+                <w:sz w:val="20"/>
+              </w:rPr>
               <w:t>0.8235</w:t>
             </w:r>
           </w:p>
         </w:tc>
         <w:tc>
           <w:tcPr>
-            <w:tcW w:type="dxa" w:w="1728"/>
+            <w:tcW w:type="dxa" w:w="1813"/>
+            <w:shd w:val="clear" w:color="auto" w:fill="FFFFFF"/>
           </w:tcPr>
           <w:p>
+            <w:pPr>
+              <w:jc w:val="center"/>
+            </w:pPr>
+            <w:r/>
             <w:r>
+              <w:rPr>
+                <w:rFonts w:ascii="Calibri" w:hAnsi="Calibri"/>
+                <w:b/>
+                <w:sz w:val="20"/>
+              </w:rPr>
               <w:t>0.8767</w:t>
             </w:r>
           </w:p>
         </w:tc>
         <w:tc>
           <w:tcPr>
-            <w:tcW w:type="dxa" w:w="1728"/>
+            <w:tcW w:type="dxa" w:w="1813"/>
+            <w:shd w:val="clear" w:color="auto" w:fill="FFFFFF"/>
           </w:tcPr>
           <w:p>
+            <w:pPr>
+              <w:jc w:val="center"/>
+            </w:pPr>
+            <w:r/>
             <w:r>
+              <w:rPr>
+                <w:rFonts w:ascii="Calibri" w:hAnsi="Calibri"/>
+                <w:b/>
+                <w:sz w:val="20"/>
+              </w:rPr>
               <w:t>0.7992</w:t>
             </w:r>
           </w:p>
         </w:tc>
         <w:tc>
           <w:tcPr>
-            <w:tcW w:type="dxa" w:w="1728"/>
+            <w:tcW w:type="dxa" w:w="1813"/>
+            <w:shd w:val="clear" w:color="auto" w:fill="FFFFFF"/>
           </w:tcPr>
           <w:p>
+            <w:pPr>
+              <w:jc w:val="center"/>
+            </w:pPr>
+            <w:r/>
             <w:r>
-              <w:t>YES</w:t>
+              <w:rPr>
+                <w:rFonts w:ascii="Calibri" w:hAnsi="Calibri"/>
+                <w:b/>
+                <w:color w:val="17875A"/>
+                <w:sz w:val="20"/>
+              </w:rPr>
+              <w:t>✔ YES</w:t>
             </w:r>
           </w:p>
         </w:tc>
@@ -1668,50 +4086,100 @@
       <w:tr>
         <w:tc>
           <w:tcPr>
-            <w:tcW w:type="dxa" w:w="1728"/>
+            <w:tcW w:type="dxa" w:w="1813"/>
+            <w:shd w:val="clear" w:color="auto" w:fill="F2F2F2"/>
           </w:tcPr>
           <w:p>
+            <w:pPr>
+              <w:jc w:val="center"/>
+            </w:pPr>
+            <w:r/>
             <w:r>
+              <w:rPr>
+                <w:rFonts w:ascii="Calibri" w:hAnsi="Calibri"/>
+                <w:b w:val="0"/>
+                <w:sz w:val="20"/>
+              </w:rPr>
               <w:t>Xgboost</w:t>
             </w:r>
           </w:p>
         </w:tc>
         <w:tc>
           <w:tcPr>
-            <w:tcW w:type="dxa" w:w="1728"/>
+            <w:tcW w:type="dxa" w:w="1813"/>
+            <w:shd w:val="clear" w:color="auto" w:fill="F2F2F2"/>
           </w:tcPr>
           <w:p>
+            <w:pPr>
+              <w:jc w:val="center"/>
+            </w:pPr>
+            <w:r/>
             <w:r>
+              <w:rPr>
+                <w:rFonts w:ascii="Calibri" w:hAnsi="Calibri"/>
+                <w:b w:val="0"/>
+                <w:sz w:val="20"/>
+              </w:rPr>
               <w:t>0.7451</w:t>
             </w:r>
           </w:p>
         </w:tc>
         <w:tc>
           <w:tcPr>
-            <w:tcW w:type="dxa" w:w="1728"/>
+            <w:tcW w:type="dxa" w:w="1813"/>
+            <w:shd w:val="clear" w:color="auto" w:fill="F2F2F2"/>
           </w:tcPr>
           <w:p>
+            <w:pPr>
+              <w:jc w:val="center"/>
+            </w:pPr>
+            <w:r/>
             <w:r>
+              <w:rPr>
+                <w:rFonts w:ascii="Calibri" w:hAnsi="Calibri"/>
+                <w:b w:val="0"/>
+                <w:sz w:val="20"/>
+              </w:rPr>
               <w:t>0.8312</w:t>
             </w:r>
           </w:p>
         </w:tc>
         <w:tc>
           <w:tcPr>
-            <w:tcW w:type="dxa" w:w="1728"/>
+            <w:tcW w:type="dxa" w:w="1813"/>
+            <w:shd w:val="clear" w:color="auto" w:fill="F2F2F2"/>
           </w:tcPr>
           <w:p>
+            <w:pPr>
+              <w:jc w:val="center"/>
+            </w:pPr>
+            <w:r/>
             <w:r>
+              <w:rPr>
+                <w:rFonts w:ascii="Calibri" w:hAnsi="Calibri"/>
+                <w:b w:val="0"/>
+                <w:sz w:val="20"/>
+              </w:rPr>
               <w:t>0.7857</w:t>
             </w:r>
           </w:p>
         </w:tc>
         <w:tc>
           <w:tcPr>
-            <w:tcW w:type="dxa" w:w="1728"/>
+            <w:tcW w:type="dxa" w:w="1813"/>
+            <w:shd w:val="clear" w:color="auto" w:fill="F2F2F2"/>
           </w:tcPr>
           <w:p>
+            <w:pPr>
+              <w:jc w:val="center"/>
+            </w:pPr>
+            <w:r/>
             <w:r>
+              <w:rPr>
+                <w:rFonts w:ascii="Calibri" w:hAnsi="Calibri"/>
+                <w:b w:val="0"/>
+                <w:sz w:val="20"/>
+              </w:rPr>
               <w:t>No</w:t>
             </w:r>
           </w:p>
@@ -1721,17 +4189,56 @@
     <w:p/>
     <w:p>
       <w:pPr>
+        <w:pStyle w:val="Heading2"/>
+        <w:spacing w:before="240" w:after="80"/>
         <w:jc w:val="left"/>
       </w:pPr>
       <w:r>
-        <w:t>Final verdict: Deploy Logistic Regression for clinical screening. Consider re-evaluating Random Forest with a larger dataset (&gt;1000 patients) where its ensemble advantage can be better utilised without overfitting risk.</w:t>
+        <w:rPr>
+          <w:color w:val="1F497D"/>
+          <w:sz w:val="26"/>
+        </w:rPr>
+        <w:t>7.3 Conclusion</w:t>
+      </w:r>
+    </w:p>
+    <w:p>
+      <w:pPr>
+        <w:spacing w:before="0" w:after="120"/>
+        <w:jc w:val="both"/>
+      </w:pPr>
+      <w:r>
+        <w:rPr>
+          <w:rFonts w:ascii="Calibri" w:hAnsi="Calibri"/>
+          <w:sz w:val="21"/>
+        </w:rPr>
+        <w:t>Logistic Regression is recommended for production deployment as a Parkinson's disease clinical screening tool. It achieves 82.4% accuracy and 0.799 ROC-AUC on unseen patients, with full transparency of its decision logic via coefficients and SHAP values. Random Forest should be re-evaluated once the dataset exceeds ~1,000 patients, at which point its ensemble advantage over Logistic Regression is expected to materialise without overfitting risk. XGBoost is not recommended at this dataset scale.</w:t>
+      </w:r>
+    </w:p>
+    <w:p/>
+    <w:p>
+      <w:pPr>
+        <w:jc w:val="center"/>
+      </w:pPr>
+      <w:r>
+        <w:rPr>
+          <w:i/>
+          <w:color w:val="888888"/>
+          <w:sz w:val="17"/>
+        </w:rPr>
+        <w:t>Report generated by src/generate_report.py  ·  Date: 06 April 2026  ·  github.com/surajmhulke/parkinson-disease-prediction</w:t>
       </w:r>
     </w:p>
     <w:sectPr>
       <w:pgSz w:w="12240" w:h="15840"/>
-      <w:pgMar w:top="1440" w:right="1800" w:bottom="1440" w:left="1800" w:header="720" w:footer="720" w:gutter="0"/>
+      <w:pgMar w:top="1417" w:right="1587" w:bottom="1417" w:left="1587" w:header="720" w:footer="720" w:gutter="0"/>
       <w:cols w:space="720"/>
       <w:docGrid w:linePitch="360"/>
+      <w:pgBorders w:offsetFrom="page">
+        <w:top w:val="single" w:sz="6" w:space="24" w:color="1F497D"/>
+        <w:left w:val="single" w:sz="6" w:space="24" w:color="1F497D"/>
+        <w:bottom w:val="single" w:sz="6" w:space="24" w:color="1F497D"/>
+        <w:right w:val="single" w:sz="6" w:space="24" w:color="1F497D"/>
+      </w:pgBorders>
     </w:sectPr>
   </w:body>
 </w:document>

</xml_diff>